<commit_message>
Las instrucciones van en la documentacion y el codigo del backend queda limpio
- Seccion 4.1 del documento: que tiene que hacer el profesor para ver la
  app (las 3 formas, paso a paso).
- El paquete ya no mete el .env dentro del codigo del backend: la
  MONGO_URI va en conexion-base-de-datos.txt, al lado del paquete.
- INSTRUCCIONES.md se genera en la raiz del paquete.
</commit_message>
<xml_diff>
--- a/evidencias/Documentacion-Bolivar-Aprende-y-Trabaja.docx
+++ b/evidencias/Documentacion-Bolivar-Aprende-y-Trabaja.docx
@@ -348,7 +348,7 @@
       <w:pPr>
         <w:pStyle w:val="Ttulo1"/>
       </w:pPr>
-      <w:bookmarkStart w:id="0" w:name="_Toc243907268"/>
+      <w:bookmarkStart w:id="0" w:name="_Toc243907968"/>
       <w:r>
         <w:t>Tabla de contenido</w:t>
       </w:r>
@@ -401,7 +401,7 @@
         <w:rPr>
           <w:noProof/>
         </w:rPr>
-        <w:instrText xml:space="preserve"> PAGEREF _Toc243907268 \h </w:instrText>
+        <w:instrText xml:space="preserve"> PAGEREF _Toc243907968 \h </w:instrText>
       </w:r>
       <w:r>
         <w:rPr>
@@ -465,7 +465,7 @@
         <w:rPr>
           <w:noProof/>
         </w:rPr>
-        <w:instrText xml:space="preserve"> PAGEREF _Toc243907269 \h </w:instrText>
+        <w:instrText xml:space="preserve"> PAGEREF _Toc243907969 \h </w:instrText>
       </w:r>
       <w:r>
         <w:rPr>
@@ -529,7 +529,7 @@
         <w:rPr>
           <w:noProof/>
         </w:rPr>
-        <w:instrText xml:space="preserve"> PAGEREF _Toc243907270 \h </w:instrText>
+        <w:instrText xml:space="preserve"> PAGEREF _Toc243907970 \h </w:instrText>
       </w:r>
       <w:r>
         <w:rPr>
@@ -593,7 +593,7 @@
         <w:rPr>
           <w:noProof/>
         </w:rPr>
-        <w:instrText xml:space="preserve"> PAGEREF _Toc243907271 \h </w:instrText>
+        <w:instrText xml:space="preserve"> PAGEREF _Toc243907971 \h </w:instrText>
       </w:r>
       <w:r>
         <w:rPr>
@@ -651,7 +651,7 @@
         <w:rPr>
           <w:noProof/>
         </w:rPr>
-        <w:instrText xml:space="preserve"> PAGEREF _Toc243907272 \h </w:instrText>
+        <w:instrText xml:space="preserve"> PAGEREF _Toc243907972 \h </w:instrText>
       </w:r>
       <w:r>
         <w:rPr>
@@ -709,7 +709,7 @@
         <w:rPr>
           <w:noProof/>
         </w:rPr>
-        <w:instrText xml:space="preserve"> PAGEREF _Toc243907273 \h </w:instrText>
+        <w:instrText xml:space="preserve"> PAGEREF _Toc243907973 \h </w:instrText>
       </w:r>
       <w:r>
         <w:rPr>
@@ -773,7 +773,7 @@
         <w:rPr>
           <w:noProof/>
         </w:rPr>
-        <w:instrText xml:space="preserve"> PAGEREF _Toc243907274 \h </w:instrText>
+        <w:instrText xml:space="preserve"> PAGEREF _Toc243907974 \h </w:instrText>
       </w:r>
       <w:r>
         <w:rPr>
@@ -813,7 +813,7 @@
         <w:rPr>
           <w:noProof/>
         </w:rPr>
-        <w:t>4.1 Levantar la API</w:t>
+        <w:t>4.1 Qué tiene que hacer el profesor para ver la app</w:t>
       </w:r>
       <w:r>
         <w:rPr>
@@ -831,7 +831,7 @@
         <w:rPr>
           <w:noProof/>
         </w:rPr>
-        <w:instrText xml:space="preserve"> PAGEREF _Toc243907275 \h </w:instrText>
+        <w:instrText xml:space="preserve"> PAGEREF _Toc243907975 \h </w:instrText>
       </w:r>
       <w:r>
         <w:rPr>
@@ -871,7 +871,7 @@
         <w:rPr>
           <w:noProof/>
         </w:rPr>
-        <w:t>4.2 Correr la aplicación</w:t>
+        <w:t>4.2 Levantar la API</w:t>
       </w:r>
       <w:r>
         <w:rPr>
@@ -889,7 +889,7 @@
         <w:rPr>
           <w:noProof/>
         </w:rPr>
-        <w:instrText xml:space="preserve"> PAGEREF _Toc243907276 \h </w:instrText>
+        <w:instrText xml:space="preserve"> PAGEREF _Toc243907976 \h </w:instrText>
       </w:r>
       <w:r>
         <w:rPr>
@@ -929,7 +929,7 @@
         <w:rPr>
           <w:noProof/>
         </w:rPr>
-        <w:t>4.3 Compilar el APK de entrega</w:t>
+        <w:t>4.3 Correr la aplicación</w:t>
       </w:r>
       <w:r>
         <w:rPr>
@@ -947,7 +947,7 @@
         <w:rPr>
           <w:noProof/>
         </w:rPr>
-        <w:instrText xml:space="preserve"> PAGEREF _Toc243907277 \h </w:instrText>
+        <w:instrText xml:space="preserve"> PAGEREF _Toc243907977 \h </w:instrText>
       </w:r>
       <w:r>
         <w:rPr>
@@ -987,7 +987,7 @@
         <w:rPr>
           <w:noProof/>
         </w:rPr>
-        <w:t>4.4 Pruebas</w:t>
+        <w:t>4.4 Compilar el APK de entrega</w:t>
       </w:r>
       <w:r>
         <w:rPr>
@@ -1005,7 +1005,123 @@
         <w:rPr>
           <w:noProof/>
         </w:rPr>
-        <w:instrText xml:space="preserve"> PAGEREF _Toc243907278 \h </w:instrText>
+        <w:instrText xml:space="preserve"> PAGEREF _Toc243907978 \h </w:instrText>
+      </w:r>
+      <w:r>
+        <w:rPr>
+          <w:noProof/>
+        </w:rPr>
+      </w:r>
+      <w:r>
+        <w:rPr>
+          <w:noProof/>
+        </w:rPr>
+        <w:fldChar w:fldCharType="separate"/>
+      </w:r>
+      <w:r>
+        <w:rPr>
+          <w:noProof/>
+        </w:rPr>
+        <w:t>7</w:t>
+      </w:r>
+      <w:r>
+        <w:rPr>
+          <w:noProof/>
+        </w:rPr>
+        <w:fldChar w:fldCharType="end"/>
+      </w:r>
+    </w:p>
+    <w:p>
+      <w:pPr>
+        <w:pStyle w:val="TDC2"/>
+        <w:tabs>
+          <w:tab w:val="right" w:leader="dot" w:pos="8828"/>
+        </w:tabs>
+        <w:rPr>
+          <w:noProof/>
+        </w:rPr>
+      </w:pPr>
+      <w:r>
+        <w:rPr>
+          <w:noProof/>
+        </w:rPr>
+        <w:t>4.5 Instalar el APK en un celular</w:t>
+      </w:r>
+      <w:r>
+        <w:rPr>
+          <w:noProof/>
+        </w:rPr>
+        <w:tab/>
+      </w:r>
+      <w:r>
+        <w:rPr>
+          <w:noProof/>
+        </w:rPr>
+        <w:fldChar w:fldCharType="begin"/>
+      </w:r>
+      <w:r>
+        <w:rPr>
+          <w:noProof/>
+        </w:rPr>
+        <w:instrText xml:space="preserve"> PAGEREF _Toc243907979 \h </w:instrText>
+      </w:r>
+      <w:r>
+        <w:rPr>
+          <w:noProof/>
+        </w:rPr>
+      </w:r>
+      <w:r>
+        <w:rPr>
+          <w:noProof/>
+        </w:rPr>
+        <w:fldChar w:fldCharType="separate"/>
+      </w:r>
+      <w:r>
+        <w:rPr>
+          <w:noProof/>
+        </w:rPr>
+        <w:t>7</w:t>
+      </w:r>
+      <w:r>
+        <w:rPr>
+          <w:noProof/>
+        </w:rPr>
+        <w:fldChar w:fldCharType="end"/>
+      </w:r>
+    </w:p>
+    <w:p>
+      <w:pPr>
+        <w:pStyle w:val="TDC2"/>
+        <w:tabs>
+          <w:tab w:val="right" w:leader="dot" w:pos="8828"/>
+        </w:tabs>
+        <w:rPr>
+          <w:noProof/>
+        </w:rPr>
+      </w:pPr>
+      <w:r>
+        <w:rPr>
+          <w:noProof/>
+        </w:rPr>
+        <w:t>4.6 Pruebas</w:t>
+      </w:r>
+      <w:r>
+        <w:rPr>
+          <w:noProof/>
+        </w:rPr>
+        <w:tab/>
+      </w:r>
+      <w:r>
+        <w:rPr>
+          <w:noProof/>
+        </w:rPr>
+        <w:fldChar w:fldCharType="begin"/>
+      </w:r>
+      <w:r>
+        <w:rPr>
+          <w:noProof/>
+        </w:rPr>
+        <w:instrText xml:space="preserve"> PAGEREF _Toc243907980 \h </w:instrText>
       </w:r>
       <w:r>
         <w:rPr>
@@ -1069,7 +1185,7 @@
         <w:rPr>
           <w:noProof/>
         </w:rPr>
-        <w:instrText xml:space="preserve"> PAGEREF _Toc243907279 \h </w:instrText>
+        <w:instrText xml:space="preserve"> PAGEREF _Toc243907981 \h </w:instrText>
       </w:r>
       <w:r>
         <w:rPr>
@@ -1086,7 +1202,7 @@
         <w:rPr>
           <w:noProof/>
         </w:rPr>
-        <w:t>7</w:t>
+        <w:t>8</w:t>
       </w:r>
       <w:r>
         <w:rPr>
@@ -1133,7 +1249,7 @@
         <w:rPr>
           <w:noProof/>
         </w:rPr>
-        <w:instrText xml:space="preserve"> PAGEREF _Toc243907280 \h </w:instrText>
+        <w:instrText xml:space="preserve"> PAGEREF _Toc243907982 \h </w:instrText>
       </w:r>
       <w:r>
         <w:rPr>
@@ -1150,7 +1266,7 @@
         <w:rPr>
           <w:noProof/>
         </w:rPr>
-        <w:t>8</w:t>
+        <w:t>9</w:t>
       </w:r>
       <w:r>
         <w:rPr>
@@ -1197,7 +1313,7 @@
         <w:rPr>
           <w:noProof/>
         </w:rPr>
-        <w:instrText xml:space="preserve"> PAGEREF _Toc243907281 \h </w:instrText>
+        <w:instrText xml:space="preserve"> PAGEREF _Toc243907983 \h </w:instrText>
       </w:r>
       <w:r>
         <w:rPr>
@@ -1255,7 +1371,7 @@
         <w:rPr>
           <w:noProof/>
         </w:rPr>
-        <w:instrText xml:space="preserve"> PAGEREF _Toc243907282 \h </w:instrText>
+        <w:instrText xml:space="preserve"> PAGEREF _Toc243907984 \h </w:instrText>
       </w:r>
       <w:r>
         <w:rPr>
@@ -1313,7 +1429,7 @@
         <w:rPr>
           <w:noProof/>
         </w:rPr>
-        <w:instrText xml:space="preserve"> PAGEREF _Toc243907283 \h </w:instrText>
+        <w:instrText xml:space="preserve"> PAGEREF _Toc243907985 \h </w:instrText>
       </w:r>
       <w:r>
         <w:rPr>
@@ -1330,7 +1446,7 @@
         <w:rPr>
           <w:noProof/>
         </w:rPr>
-        <w:t>9</w:t>
+        <w:t>10</w:t>
       </w:r>
       <w:r>
         <w:rPr>
@@ -1371,7 +1487,7 @@
         <w:rPr>
           <w:noProof/>
         </w:rPr>
-        <w:instrText xml:space="preserve"> PAGEREF _Toc243907284 \h </w:instrText>
+        <w:instrText xml:space="preserve"> PAGEREF _Toc243907986 \h </w:instrText>
       </w:r>
       <w:r>
         <w:rPr>
@@ -1388,7 +1504,7 @@
         <w:rPr>
           <w:noProof/>
         </w:rPr>
-        <w:t>9</w:t>
+        <w:t>10</w:t>
       </w:r>
       <w:r>
         <w:rPr>
@@ -1412,7 +1528,7 @@
       <w:pPr>
         <w:pStyle w:val="Ttulo1"/>
       </w:pPr>
-      <w:bookmarkStart w:id="1" w:name="_Toc243907269"/>
+      <w:bookmarkStart w:id="1" w:name="_Toc243907969"/>
       <w:r>
         <w:t>1. Introducción</w:t>
       </w:r>
@@ -1437,7 +1553,7 @@
       <w:pPr>
         <w:pStyle w:val="Ttulo1"/>
       </w:pPr>
-      <w:bookmarkStart w:id="2" w:name="_Toc243907270"/>
+      <w:bookmarkStart w:id="2" w:name="_Toc243907970"/>
       <w:r>
         <w:t>2. Descripción de la actividad</w:t>
       </w:r>
@@ -1502,8 +1618,9 @@
       <w:pPr>
         <w:pStyle w:val="Ttulo1"/>
       </w:pPr>
-      <w:bookmarkStart w:id="3" w:name="_Toc243907271"/>
-      <w:r>
+      <w:bookmarkStart w:id="3" w:name="_Toc243907971"/>
+      <w:r>
+        <w:lastRenderedPageBreak/>
         <w:t>3. Requisitos</w:t>
       </w:r>
       <w:bookmarkEnd w:id="3"/>
@@ -1512,7 +1629,7 @@
       <w:pPr>
         <w:pStyle w:val="Ttulo2"/>
       </w:pPr>
-      <w:bookmarkStart w:id="4" w:name="_Toc243907272"/>
+      <w:bookmarkStart w:id="4" w:name="_Toc243907972"/>
       <w:r>
         <w:t>3.1 Requisitos funcionales</w:t>
       </w:r>
@@ -2565,6 +2682,7 @@
               <w:rPr>
                 <w:sz w:val="18"/>
               </w:rPr>
+              <w:lastRenderedPageBreak/>
               <w:t>RF16</w:t>
             </w:r>
           </w:p>
@@ -2674,7 +2792,7 @@
       <w:pPr>
         <w:pStyle w:val="Ttulo2"/>
       </w:pPr>
-      <w:bookmarkStart w:id="5" w:name="_Toc243907273"/>
+      <w:bookmarkStart w:id="5" w:name="_Toc243907973"/>
       <w:r>
         <w:t>3.2 Requisitos no funcionales</w:t>
       </w:r>
@@ -3464,8 +3582,9 @@
       <w:pPr>
         <w:pStyle w:val="Ttulo1"/>
       </w:pPr>
-      <w:bookmarkStart w:id="6" w:name="_Toc243907274"/>
-      <w:r>
+      <w:bookmarkStart w:id="6" w:name="_Toc243907974"/>
+      <w:r>
+        <w:lastRenderedPageBreak/>
         <w:t>4. Configuración y puesta en marcha</w:t>
       </w:r>
       <w:bookmarkEnd w:id="6"/>
@@ -3479,11 +3598,50 @@
       <w:pPr>
         <w:pStyle w:val="Ttulo2"/>
       </w:pPr>
-      <w:bookmarkStart w:id="7" w:name="_Toc243907275"/>
-      <w:r>
-        <w:t>4.1 Levantar la API</w:t>
+      <w:bookmarkStart w:id="7" w:name="_Toc243907975"/>
+      <w:r>
+        <w:t>4.1 Qué tiene que hacer el profesor para ver la app</w:t>
       </w:r>
       <w:bookmarkEnd w:id="7"/>
+    </w:p>
+    <w:p>
+      <w:r>
+        <w:t>La aplicación no tiene base de datos propia: necesita la API encendida. Hay tres formas de dejarlo funcionando:</w:t>
+      </w:r>
+    </w:p>
+    <w:p>
+      <w:pPr>
+        <w:pStyle w:val="Prrafodelista"/>
+      </w:pPr>
+      <w:r>
+        <w:t>Forma A — En la sustentación, en el salón: con el backend encendido en el equipo (npm start) y el celular del profesor en la misma red Wi-Fi. El APK ya viene con la dirección de ese equipo, así que la app se conecta sola y muestra el chip verde "API conectada". Si el equipo cambia de red, basta con tocar "Reintentar" en la app.</w:t>
+      </w:r>
+    </w:p>
+    <w:p>
+      <w:pPr>
+        <w:pStyle w:val="Prrafodelista"/>
+      </w:pPr>
+      <w:r>
+        <w:t>Forma B — En la casa del profesor, con el código: instala Node.js 18 o superior, descomprime el paquete, entra a la carpeta backend, copia .env.example como .env y pega el valor de MONGO_URI, y ejecuta npm install, npm run seed y npm start. Después instala el APK: en el emulador de Android Studio funciona directo, y en un celular físico toca el botón "Servidor: ..." de la pantalla de inicio de sesión y escribe la dirección de su computador (por ejemplo http://192.168.1.50:4000/api). La app la recuerda.</w:t>
+      </w:r>
+    </w:p>
+    <w:p>
+      <w:pPr>
+        <w:pStyle w:val="Prrafodelista"/>
+      </w:pPr>
+      <w:r>
+        <w:t>Forma C — Desde cualquier parte del mundo: publicar la API en internet (gratis) y recompilar el APK apuntando a esa dirección pública. El proceso está explicado en el README del proyecto.</w:t>
+      </w:r>
+    </w:p>
+    <w:p>
+      <w:pPr>
+        <w:pStyle w:val="Ttulo2"/>
+      </w:pPr>
+      <w:bookmarkStart w:id="8" w:name="_Toc243907976"/>
+      <w:r>
+        <w:t>4.2 Levantar la API</w:t>
+      </w:r>
+      <w:bookmarkEnd w:id="8"/>
     </w:p>
     <w:p>
       <w:r>
@@ -3930,14 +4088,19 @@
       </w:r>
     </w:p>
     <w:p>
+      <w:r>
+        <w:t>La primera vez el servidor tarda unos 40 segundos en arrancar, porque la base de datos está en Atlas y la conexión es por internet.</w:t>
+      </w:r>
+    </w:p>
+    <w:p>
       <w:pPr>
         <w:pStyle w:val="Ttulo2"/>
       </w:pPr>
-      <w:bookmarkStart w:id="8" w:name="_Toc243907276"/>
-      <w:r>
-        <w:t>4.2 Correr la aplicación</w:t>
-      </w:r>
-      <w:bookmarkEnd w:id="8"/>
+      <w:bookmarkStart w:id="9" w:name="_Toc243907977"/>
+      <w:r>
+        <w:t>4.3 Correr la aplicación</w:t>
+      </w:r>
+      <w:bookmarkEnd w:id="9"/>
     </w:p>
     <w:p>
       <w:r>
@@ -3969,11 +4132,11 @@
       <w:pPr>
         <w:pStyle w:val="Ttulo2"/>
       </w:pPr>
-      <w:bookmarkStart w:id="9" w:name="_Toc243907277"/>
-      <w:r>
-        <w:t>4.3 Compilar el APK de entrega</w:t>
-      </w:r>
-      <w:bookmarkEnd w:id="9"/>
+      <w:bookmarkStart w:id="10" w:name="_Toc243907978"/>
+      <w:r>
+        <w:t>4.4 Compilar el APK de entrega</w:t>
+      </w:r>
+      <w:bookmarkEnd w:id="10"/>
     </w:p>
     <w:p>
       <w:pPr>
@@ -3992,11 +4155,50 @@
       <w:pPr>
         <w:pStyle w:val="Ttulo2"/>
       </w:pPr>
-      <w:bookmarkStart w:id="10" w:name="_Toc243907278"/>
-      <w:r>
-        <w:t>4.4 Pruebas</w:t>
-      </w:r>
-      <w:bookmarkEnd w:id="10"/>
+      <w:bookmarkStart w:id="11" w:name="_Toc243907979"/>
+      <w:r>
+        <w:t>4.5 Instalar el APK en un celular</w:t>
+      </w:r>
+      <w:bookmarkEnd w:id="11"/>
+    </w:p>
+    <w:p>
+      <w:pPr>
+        <w:pStyle w:val="Prrafodelista"/>
+      </w:pPr>
+      <w:r>
+        <w:t>Se le pasa el archivo app-release.apk al celular (WhatsApp, Drive o cable).</w:t>
+      </w:r>
+    </w:p>
+    <w:p>
+      <w:pPr>
+        <w:pStyle w:val="Prrafodelista"/>
+      </w:pPr>
+      <w:r>
+        <w:t>En el celular: Ajustes → Aplicaciones → acceso especial → Instalar aplicaciones desconocidas → se activa la app desde donde se abre el archivo.</w:t>
+      </w:r>
+    </w:p>
+    <w:p>
+      <w:pPr>
+        <w:pStyle w:val="Prrafodelista"/>
+      </w:pPr>
+      <w:r>
+        <w:t>Se abre el archivo y se le da a Instalar. Android pregunta si se permite la instalación: se acepta.</w:t>
+      </w:r>
+    </w:p>
+    <w:p>
+      <w:r>
+        <w:t>El APK va firmado con la llave de depuración, que es lo normal en un proyecto académico: no hace falta ningún archivo de firma extra.</w:t>
+      </w:r>
+    </w:p>
+    <w:p>
+      <w:pPr>
+        <w:pStyle w:val="Ttulo2"/>
+      </w:pPr>
+      <w:bookmarkStart w:id="12" w:name="_Toc243907980"/>
+      <w:r>
+        <w:t>4.6 Pruebas</w:t>
+      </w:r>
+      <w:bookmarkEnd w:id="12"/>
     </w:p>
     <w:tbl>
       <w:tblPr>
@@ -4529,11 +4731,11 @@
       <w:pPr>
         <w:pStyle w:val="Ttulo1"/>
       </w:pPr>
-      <w:bookmarkStart w:id="11" w:name="_Toc243907279"/>
+      <w:bookmarkStart w:id="13" w:name="_Toc243907981"/>
       <w:r>
         <w:t>5. Resultados</w:t>
       </w:r>
-      <w:bookmarkEnd w:id="11"/>
+      <w:bookmarkEnd w:id="13"/>
     </w:p>
     <w:p>
       <w:r>
@@ -4898,11 +5100,11 @@
       <w:pPr>
         <w:pStyle w:val="Ttulo1"/>
       </w:pPr>
-      <w:bookmarkStart w:id="12" w:name="_Toc243907280"/>
+      <w:bookmarkStart w:id="14" w:name="_Toc243907982"/>
       <w:r>
         <w:t>6. Conclusiones</w:t>
       </w:r>
-      <w:bookmarkEnd w:id="12"/>
+      <w:bookmarkEnd w:id="14"/>
     </w:p>
     <w:p>
       <w:r>
@@ -4928,21 +5130,21 @@
       <w:pPr>
         <w:pStyle w:val="Ttulo1"/>
       </w:pPr>
-      <w:bookmarkStart w:id="13" w:name="_Toc243907281"/>
+      <w:bookmarkStart w:id="15" w:name="_Toc243907983"/>
       <w:r>
         <w:t>7. Anexo</w:t>
       </w:r>
-      <w:bookmarkEnd w:id="13"/>
+      <w:bookmarkEnd w:id="15"/>
     </w:p>
     <w:p>
       <w:pPr>
         <w:pStyle w:val="Ttulo2"/>
       </w:pPr>
-      <w:bookmarkStart w:id="14" w:name="_Toc243907282"/>
+      <w:bookmarkStart w:id="16" w:name="_Toc243907984"/>
       <w:r>
         <w:t>7.1 Enlaces</w:t>
       </w:r>
-      <w:bookmarkEnd w:id="14"/>
+      <w:bookmarkEnd w:id="16"/>
     </w:p>
     <w:tbl>
       <w:tblPr>
@@ -5234,17 +5436,61 @@
           </w:p>
         </w:tc>
       </w:tr>
+      <w:tr>
+        <w:tblPrEx>
+          <w:tblCellMar>
+            <w:top w:w="0" w:type="dxa"/>
+            <w:bottom w:w="0" w:type="dxa"/>
+          </w:tblCellMar>
+        </w:tblPrEx>
+        <w:tc>
+          <w:tcPr>
+            <w:tcW w:w="4419" w:type="dxa"/>
+          </w:tcPr>
+          <w:p>
+            <w:pPr>
+              <w:rPr>
+                <w:sz w:val="18"/>
+              </w:rPr>
+            </w:pPr>
+            <w:r>
+              <w:rPr>
+                <w:sz w:val="18"/>
+              </w:rPr>
+              <w:t>Dirección de MongoDB Atlas</w:t>
+            </w:r>
+          </w:p>
+        </w:tc>
+        <w:tc>
+          <w:tcPr>
+            <w:tcW w:w="4419" w:type="dxa"/>
+          </w:tcPr>
+          <w:p>
+            <w:pPr>
+              <w:rPr>
+                <w:sz w:val="18"/>
+              </w:rPr>
+            </w:pPr>
+            <w:r>
+              <w:rPr>
+                <w:sz w:val="18"/>
+              </w:rPr>
+              <w:t>archivo conexion-base-de-datos.txt del paquete</w:t>
+            </w:r>
+          </w:p>
+        </w:tc>
+      </w:tr>
     </w:tbl>
     <w:p/>
     <w:p>
       <w:pPr>
         <w:pStyle w:val="Ttulo2"/>
       </w:pPr>
-      <w:bookmarkStart w:id="15" w:name="_Toc243907283"/>
+      <w:bookmarkStart w:id="17" w:name="_Toc243907985"/>
       <w:r>
         <w:t>7.2 Contenido del paquete de entrega</w:t>
       </w:r>
-      <w:bookmarkEnd w:id="15"/>
+      <w:bookmarkEnd w:id="17"/>
     </w:p>
     <w:tbl>
       <w:tblPr>
@@ -5443,7 +5689,51 @@
               <w:rPr>
                 <w:sz w:val="18"/>
               </w:rPr>
-              <w:t>Cómo instalar la app, probarla y levantar la API.</w:t>
+              <w:t>Resumen: las 3 formas de ver la app y cómo instalar el APK.</w:t>
+            </w:r>
+          </w:p>
+        </w:tc>
+      </w:tr>
+      <w:tr>
+        <w:tblPrEx>
+          <w:tblCellMar>
+            <w:top w:w="0" w:type="dxa"/>
+            <w:bottom w:w="0" w:type="dxa"/>
+          </w:tblCellMar>
+        </w:tblPrEx>
+        <w:tc>
+          <w:tcPr>
+            <w:tcW w:w="4419" w:type="dxa"/>
+          </w:tcPr>
+          <w:p>
+            <w:pPr>
+              <w:rPr>
+                <w:sz w:val="18"/>
+              </w:rPr>
+            </w:pPr>
+            <w:r>
+              <w:rPr>
+                <w:sz w:val="18"/>
+              </w:rPr>
+              <w:t>conexion-base-de-datos.txt</w:t>
+            </w:r>
+          </w:p>
+        </w:tc>
+        <w:tc>
+          <w:tcPr>
+            <w:tcW w:w="4419" w:type="dxa"/>
+          </w:tcPr>
+          <w:p>
+            <w:pPr>
+              <w:rPr>
+                <w:sz w:val="18"/>
+              </w:rPr>
+            </w:pPr>
+            <w:r>
+              <w:rPr>
+                <w:sz w:val="18"/>
+              </w:rPr>
+              <w:t>El valor de MONGO_URI para levantar la API.</w:t>
             </w:r>
           </w:p>
         </w:tc>
@@ -5586,11 +5876,11 @@
       <w:pPr>
         <w:pStyle w:val="Ttulo2"/>
       </w:pPr>
-      <w:bookmarkStart w:id="16" w:name="_Toc243907284"/>
+      <w:bookmarkStart w:id="18" w:name="_Toc243907986"/>
       <w:r>
         <w:t>7.3 Estructura del proyecto</w:t>
       </w:r>
-      <w:bookmarkEnd w:id="16"/>
+      <w:bookmarkEnd w:id="18"/>
     </w:p>
     <w:tbl>
       <w:tblPr>
@@ -6330,10 +6620,10 @@
           <w:noProof/>
         </w:rPr>
         <w:drawing>
-          <wp:inline distT="0" distB="0" distL="0" distR="0" wp14:anchorId="5B479C59" wp14:editId="2BC73189">
+          <wp:inline distT="0" distB="0" distL="0" distR="0" wp14:anchorId="47E7350D" wp14:editId="4A375F11">
             <wp:extent cx="4318000" cy="9355307"/>
             <wp:effectExtent l="0" t="0" r="6350" b="0"/>
-            <wp:docPr id="1232687575" name="Imagen 1"/>
+            <wp:docPr id="1369461446" name="Imagen 1"/>
             <wp:cNvGraphicFramePr>
               <a:graphicFrameLocks xmlns:a="http://schemas.openxmlformats.org/drawingml/2006/main" noChangeAspect="1"/>
             </wp:cNvGraphicFramePr>
@@ -6341,7 +6631,7 @@
               <a:graphicData uri="http://schemas.openxmlformats.org/drawingml/2006/picture">
                 <pic:pic xmlns:pic="http://schemas.openxmlformats.org/drawingml/2006/picture">
                   <pic:nvPicPr>
-                    <pic:cNvPr id="1232687575" name=""/>
+                    <pic:cNvPr id="1369461446" name=""/>
                     <pic:cNvPicPr/>
                   </pic:nvPicPr>
                   <pic:blipFill>
@@ -6388,10 +6678,10 @@
           <w:noProof/>
         </w:rPr>
         <w:drawing>
-          <wp:inline distT="0" distB="0" distL="0" distR="0" wp14:anchorId="7A5C9587" wp14:editId="56AFA7DA">
+          <wp:inline distT="0" distB="0" distL="0" distR="0" wp14:anchorId="3A732558" wp14:editId="18889135">
             <wp:extent cx="4318000" cy="9355307"/>
             <wp:effectExtent l="0" t="0" r="6350" b="0"/>
-            <wp:docPr id="500464156" name="Imagen 2"/>
+            <wp:docPr id="159713808" name="Imagen 2"/>
             <wp:cNvGraphicFramePr>
               <a:graphicFrameLocks xmlns:a="http://schemas.openxmlformats.org/drawingml/2006/main" noChangeAspect="1"/>
             </wp:cNvGraphicFramePr>
@@ -6399,7 +6689,7 @@
               <a:graphicData uri="http://schemas.openxmlformats.org/drawingml/2006/picture">
                 <pic:pic xmlns:pic="http://schemas.openxmlformats.org/drawingml/2006/picture">
                   <pic:nvPicPr>
-                    <pic:cNvPr id="500464156" name=""/>
+                    <pic:cNvPr id="159713808" name=""/>
                     <pic:cNvPicPr/>
                   </pic:nvPicPr>
                   <pic:blipFill>
@@ -6446,10 +6736,10 @@
           <w:noProof/>
         </w:rPr>
         <w:drawing>
-          <wp:inline distT="0" distB="0" distL="0" distR="0" wp14:anchorId="756B05ED" wp14:editId="606D284B">
+          <wp:inline distT="0" distB="0" distL="0" distR="0" wp14:anchorId="3E433DFA" wp14:editId="7D49EFFC">
             <wp:extent cx="4318000" cy="9355307"/>
             <wp:effectExtent l="0" t="0" r="6350" b="0"/>
-            <wp:docPr id="2057348705" name="Imagen 3"/>
+            <wp:docPr id="1378701793" name="Imagen 3"/>
             <wp:cNvGraphicFramePr>
               <a:graphicFrameLocks xmlns:a="http://schemas.openxmlformats.org/drawingml/2006/main" noChangeAspect="1"/>
             </wp:cNvGraphicFramePr>
@@ -6457,7 +6747,7 @@
               <a:graphicData uri="http://schemas.openxmlformats.org/drawingml/2006/picture">
                 <pic:pic xmlns:pic="http://schemas.openxmlformats.org/drawingml/2006/picture">
                   <pic:nvPicPr>
-                    <pic:cNvPr id="2057348705" name=""/>
+                    <pic:cNvPr id="1378701793" name=""/>
                     <pic:cNvPicPr/>
                   </pic:nvPicPr>
                   <pic:blipFill>
@@ -6504,10 +6794,10 @@
           <w:noProof/>
         </w:rPr>
         <w:drawing>
-          <wp:inline distT="0" distB="0" distL="0" distR="0" wp14:anchorId="4E53CED6" wp14:editId="23DFEBFE">
+          <wp:inline distT="0" distB="0" distL="0" distR="0" wp14:anchorId="4E8605FB" wp14:editId="58B6F10A">
             <wp:extent cx="4318000" cy="9355307"/>
             <wp:effectExtent l="0" t="0" r="6350" b="0"/>
-            <wp:docPr id="1477964944" name="Imagen 4"/>
+            <wp:docPr id="1346460803" name="Imagen 4"/>
             <wp:cNvGraphicFramePr>
               <a:graphicFrameLocks xmlns:a="http://schemas.openxmlformats.org/drawingml/2006/main" noChangeAspect="1"/>
             </wp:cNvGraphicFramePr>
@@ -6515,7 +6805,7 @@
               <a:graphicData uri="http://schemas.openxmlformats.org/drawingml/2006/picture">
                 <pic:pic xmlns:pic="http://schemas.openxmlformats.org/drawingml/2006/picture">
                   <pic:nvPicPr>
-                    <pic:cNvPr id="1477964944" name=""/>
+                    <pic:cNvPr id="1346460803" name=""/>
                     <pic:cNvPicPr/>
                   </pic:nvPicPr>
                   <pic:blipFill>
@@ -6562,10 +6852,10 @@
           <w:noProof/>
         </w:rPr>
         <w:drawing>
-          <wp:inline distT="0" distB="0" distL="0" distR="0" wp14:anchorId="04AA7222" wp14:editId="6DE27643">
+          <wp:inline distT="0" distB="0" distL="0" distR="0" wp14:anchorId="26CC987A" wp14:editId="314C571E">
             <wp:extent cx="4318000" cy="9355307"/>
             <wp:effectExtent l="0" t="0" r="6350" b="0"/>
-            <wp:docPr id="506234256" name="Imagen 5"/>
+            <wp:docPr id="184000825" name="Imagen 5"/>
             <wp:cNvGraphicFramePr>
               <a:graphicFrameLocks xmlns:a="http://schemas.openxmlformats.org/drawingml/2006/main" noChangeAspect="1"/>
             </wp:cNvGraphicFramePr>
@@ -6573,7 +6863,7 @@
               <a:graphicData uri="http://schemas.openxmlformats.org/drawingml/2006/picture">
                 <pic:pic xmlns:pic="http://schemas.openxmlformats.org/drawingml/2006/picture">
                   <pic:nvPicPr>
-                    <pic:cNvPr id="506234256" name=""/>
+                    <pic:cNvPr id="184000825" name=""/>
                     <pic:cNvPicPr/>
                   </pic:nvPicPr>
                   <pic:blipFill>
@@ -6620,10 +6910,10 @@
           <w:noProof/>
         </w:rPr>
         <w:drawing>
-          <wp:inline distT="0" distB="0" distL="0" distR="0" wp14:anchorId="7D9CADC7" wp14:editId="4BAAAE03">
+          <wp:inline distT="0" distB="0" distL="0" distR="0" wp14:anchorId="08764DFC" wp14:editId="7AF2023A">
             <wp:extent cx="4318000" cy="9355307"/>
             <wp:effectExtent l="0" t="0" r="6350" b="0"/>
-            <wp:docPr id="599251450" name="Imagen 6"/>
+            <wp:docPr id="1904279758" name="Imagen 6"/>
             <wp:cNvGraphicFramePr>
               <a:graphicFrameLocks xmlns:a="http://schemas.openxmlformats.org/drawingml/2006/main" noChangeAspect="1"/>
             </wp:cNvGraphicFramePr>
@@ -6631,7 +6921,7 @@
               <a:graphicData uri="http://schemas.openxmlformats.org/drawingml/2006/picture">
                 <pic:pic xmlns:pic="http://schemas.openxmlformats.org/drawingml/2006/picture">
                   <pic:nvPicPr>
-                    <pic:cNvPr id="599251450" name=""/>
+                    <pic:cNvPr id="1904279758" name=""/>
                     <pic:cNvPicPr/>
                   </pic:nvPicPr>
                   <pic:blipFill>
@@ -6678,10 +6968,10 @@
           <w:noProof/>
         </w:rPr>
         <w:drawing>
-          <wp:inline distT="0" distB="0" distL="0" distR="0" wp14:anchorId="00921AC8" wp14:editId="641EC0F1">
+          <wp:inline distT="0" distB="0" distL="0" distR="0" wp14:anchorId="40F642ED" wp14:editId="013B00AA">
             <wp:extent cx="4318000" cy="3626182"/>
             <wp:effectExtent l="0" t="0" r="6350" b="0"/>
-            <wp:docPr id="1162862669" name="Imagen 7"/>
+            <wp:docPr id="1623560945" name="Imagen 7"/>
             <wp:cNvGraphicFramePr>
               <a:graphicFrameLocks xmlns:a="http://schemas.openxmlformats.org/drawingml/2006/main" noChangeAspect="1"/>
             </wp:cNvGraphicFramePr>
@@ -6689,7 +6979,7 @@
               <a:graphicData uri="http://schemas.openxmlformats.org/drawingml/2006/picture">
                 <pic:pic xmlns:pic="http://schemas.openxmlformats.org/drawingml/2006/picture">
                   <pic:nvPicPr>
-                    <pic:cNvPr id="1162862669" name=""/>
+                    <pic:cNvPr id="1623560945" name=""/>
                     <pic:cNvPicPr/>
                   </pic:nvPicPr>
                   <pic:blipFill>
@@ -7147,7 +7437,7 @@
     <w:link w:val="Ttulo1Car"/>
     <w:uiPriority w:val="9"/>
     <w:qFormat/>
-    <w:rsid w:val="009628EB"/>
+    <w:rsid w:val="00761970"/>
     <w:pPr>
       <w:keepNext/>
       <w:keepLines/>
@@ -7169,7 +7459,7 @@
     <w:uiPriority w:val="9"/>
     <w:unhideWhenUsed/>
     <w:qFormat/>
-    <w:rsid w:val="009628EB"/>
+    <w:rsid w:val="00761970"/>
     <w:pPr>
       <w:keepNext/>
       <w:keepLines/>
@@ -7192,7 +7482,7 @@
     <w:semiHidden/>
     <w:unhideWhenUsed/>
     <w:qFormat/>
-    <w:rsid w:val="009628EB"/>
+    <w:rsid w:val="00761970"/>
     <w:pPr>
       <w:keepNext/>
       <w:keepLines/>
@@ -7215,7 +7505,7 @@
     <w:semiHidden/>
     <w:unhideWhenUsed/>
     <w:qFormat/>
-    <w:rsid w:val="009628EB"/>
+    <w:rsid w:val="00761970"/>
     <w:pPr>
       <w:keepNext/>
       <w:keepLines/>
@@ -7238,7 +7528,7 @@
     <w:semiHidden/>
     <w:unhideWhenUsed/>
     <w:qFormat/>
-    <w:rsid w:val="009628EB"/>
+    <w:rsid w:val="00761970"/>
     <w:pPr>
       <w:keepNext/>
       <w:keepLines/>
@@ -7259,7 +7549,7 @@
     <w:semiHidden/>
     <w:unhideWhenUsed/>
     <w:qFormat/>
-    <w:rsid w:val="009628EB"/>
+    <w:rsid w:val="00761970"/>
     <w:pPr>
       <w:keepNext/>
       <w:keepLines/>
@@ -7282,7 +7572,7 @@
     <w:semiHidden/>
     <w:unhideWhenUsed/>
     <w:qFormat/>
-    <w:rsid w:val="009628EB"/>
+    <w:rsid w:val="00761970"/>
     <w:pPr>
       <w:keepNext/>
       <w:keepLines/>
@@ -7303,7 +7593,7 @@
     <w:semiHidden/>
     <w:unhideWhenUsed/>
     <w:qFormat/>
-    <w:rsid w:val="009628EB"/>
+    <w:rsid w:val="00761970"/>
     <w:pPr>
       <w:keepNext/>
       <w:keepLines/>
@@ -7326,7 +7616,7 @@
     <w:semiHidden/>
     <w:unhideWhenUsed/>
     <w:qFormat/>
-    <w:rsid w:val="009628EB"/>
+    <w:rsid w:val="00761970"/>
     <w:pPr>
       <w:keepNext/>
       <w:keepLines/>
@@ -7370,7 +7660,7 @@
     <w:basedOn w:val="Fuentedeprrafopredeter"/>
     <w:link w:val="Ttulo1"/>
     <w:uiPriority w:val="9"/>
-    <w:rsid w:val="009628EB"/>
+    <w:rsid w:val="00761970"/>
     <w:rPr>
       <w:rFonts w:asciiTheme="majorHAnsi" w:eastAsiaTheme="majorEastAsia" w:hAnsiTheme="majorHAnsi" w:cstheme="majorBidi"/>
       <w:color w:val="2F5496" w:themeColor="accent1" w:themeShade="BF"/>
@@ -7383,7 +7673,7 @@
     <w:basedOn w:val="Fuentedeprrafopredeter"/>
     <w:link w:val="Ttulo2"/>
     <w:uiPriority w:val="9"/>
-    <w:rsid w:val="009628EB"/>
+    <w:rsid w:val="00761970"/>
     <w:rPr>
       <w:rFonts w:asciiTheme="majorHAnsi" w:eastAsiaTheme="majorEastAsia" w:hAnsiTheme="majorHAnsi" w:cstheme="majorBidi"/>
       <w:color w:val="2F5496" w:themeColor="accent1" w:themeShade="BF"/>
@@ -7397,7 +7687,7 @@
     <w:link w:val="Ttulo3"/>
     <w:uiPriority w:val="9"/>
     <w:semiHidden/>
-    <w:rsid w:val="009628EB"/>
+    <w:rsid w:val="00761970"/>
     <w:rPr>
       <w:rFonts w:eastAsiaTheme="majorEastAsia" w:cstheme="majorBidi"/>
       <w:color w:val="2F5496" w:themeColor="accent1" w:themeShade="BF"/>
@@ -7411,7 +7701,7 @@
     <w:link w:val="Ttulo4"/>
     <w:uiPriority w:val="9"/>
     <w:semiHidden/>
-    <w:rsid w:val="009628EB"/>
+    <w:rsid w:val="00761970"/>
     <w:rPr>
       <w:rFonts w:eastAsiaTheme="majorEastAsia" w:cstheme="majorBidi"/>
       <w:i/>
@@ -7425,7 +7715,7 @@
     <w:link w:val="Ttulo5"/>
     <w:uiPriority w:val="9"/>
     <w:semiHidden/>
-    <w:rsid w:val="009628EB"/>
+    <w:rsid w:val="00761970"/>
     <w:rPr>
       <w:rFonts w:eastAsiaTheme="majorEastAsia" w:cstheme="majorBidi"/>
       <w:color w:val="2F5496" w:themeColor="accent1" w:themeShade="BF"/>
@@ -7437,7 +7727,7 @@
     <w:link w:val="Ttulo6"/>
     <w:uiPriority w:val="9"/>
     <w:semiHidden/>
-    <w:rsid w:val="009628EB"/>
+    <w:rsid w:val="00761970"/>
     <w:rPr>
       <w:rFonts w:eastAsiaTheme="majorEastAsia" w:cstheme="majorBidi"/>
       <w:i/>
@@ -7451,7 +7741,7 @@
     <w:link w:val="Ttulo7"/>
     <w:uiPriority w:val="9"/>
     <w:semiHidden/>
-    <w:rsid w:val="009628EB"/>
+    <w:rsid w:val="00761970"/>
     <w:rPr>
       <w:rFonts w:eastAsiaTheme="majorEastAsia" w:cstheme="majorBidi"/>
       <w:color w:val="595959" w:themeColor="text1" w:themeTint="A6"/>
@@ -7463,7 +7753,7 @@
     <w:link w:val="Ttulo8"/>
     <w:uiPriority w:val="9"/>
     <w:semiHidden/>
-    <w:rsid w:val="009628EB"/>
+    <w:rsid w:val="00761970"/>
     <w:rPr>
       <w:rFonts w:eastAsiaTheme="majorEastAsia" w:cstheme="majorBidi"/>
       <w:i/>
@@ -7477,7 +7767,7 @@
     <w:link w:val="Ttulo9"/>
     <w:uiPriority w:val="9"/>
     <w:semiHidden/>
-    <w:rsid w:val="009628EB"/>
+    <w:rsid w:val="00761970"/>
     <w:rPr>
       <w:rFonts w:eastAsiaTheme="majorEastAsia" w:cstheme="majorBidi"/>
       <w:color w:val="272727" w:themeColor="text1" w:themeTint="D8"/>
@@ -7490,7 +7780,7 @@
     <w:link w:val="TtuloCar"/>
     <w:uiPriority w:val="10"/>
     <w:qFormat/>
-    <w:rsid w:val="009628EB"/>
+    <w:rsid w:val="00761970"/>
     <w:pPr>
       <w:spacing w:after="80" w:line="240" w:lineRule="auto"/>
       <w:contextualSpacing/>
@@ -7508,7 +7798,7 @@
     <w:basedOn w:val="Fuentedeprrafopredeter"/>
     <w:link w:val="Ttulo"/>
     <w:uiPriority w:val="10"/>
-    <w:rsid w:val="009628EB"/>
+    <w:rsid w:val="00761970"/>
     <w:rPr>
       <w:rFonts w:asciiTheme="majorHAnsi" w:eastAsiaTheme="majorEastAsia" w:hAnsiTheme="majorHAnsi" w:cstheme="majorBidi"/>
       <w:spacing w:val="-10"/>
@@ -7524,7 +7814,7 @@
     <w:link w:val="SubttuloCar"/>
     <w:uiPriority w:val="11"/>
     <w:qFormat/>
-    <w:rsid w:val="009628EB"/>
+    <w:rsid w:val="00761970"/>
     <w:pPr>
       <w:numPr>
         <w:ilvl w:val="1"/>
@@ -7543,7 +7833,7 @@
     <w:basedOn w:val="Fuentedeprrafopredeter"/>
     <w:link w:val="Subttulo"/>
     <w:uiPriority w:val="11"/>
-    <w:rsid w:val="009628EB"/>
+    <w:rsid w:val="00761970"/>
     <w:rPr>
       <w:rFonts w:eastAsiaTheme="majorEastAsia" w:cstheme="majorBidi"/>
       <w:color w:val="595959" w:themeColor="text1" w:themeTint="A6"/>
@@ -7559,7 +7849,7 @@
     <w:link w:val="CitaCar"/>
     <w:uiPriority w:val="29"/>
     <w:qFormat/>
-    <w:rsid w:val="009628EB"/>
+    <w:rsid w:val="00761970"/>
     <w:pPr>
       <w:spacing w:before="160"/>
       <w:jc w:val="center"/>
@@ -7575,7 +7865,7 @@
     <w:basedOn w:val="Fuentedeprrafopredeter"/>
     <w:link w:val="Cita"/>
     <w:uiPriority w:val="29"/>
-    <w:rsid w:val="009628EB"/>
+    <w:rsid w:val="00761970"/>
     <w:rPr>
       <w:i/>
       <w:iCs/>
@@ -7587,7 +7877,7 @@
     <w:basedOn w:val="Normal"/>
     <w:uiPriority w:val="34"/>
     <w:qFormat/>
-    <w:rsid w:val="009628EB"/>
+    <w:rsid w:val="00761970"/>
     <w:pPr>
       <w:ind w:left="720"/>
       <w:contextualSpacing/>
@@ -7598,7 +7888,7 @@
     <w:basedOn w:val="Fuentedeprrafopredeter"/>
     <w:uiPriority w:val="21"/>
     <w:qFormat/>
-    <w:rsid w:val="009628EB"/>
+    <w:rsid w:val="00761970"/>
     <w:rPr>
       <w:i/>
       <w:iCs/>
@@ -7612,7 +7902,7 @@
     <w:link w:val="CitadestacadaCar"/>
     <w:uiPriority w:val="30"/>
     <w:qFormat/>
-    <w:rsid w:val="009628EB"/>
+    <w:rsid w:val="00761970"/>
     <w:pPr>
       <w:pBdr>
         <w:top w:val="single" w:sz="4" w:space="10" w:color="2F5496" w:themeColor="accent1" w:themeShade="BF"/>
@@ -7633,7 +7923,7 @@
     <w:basedOn w:val="Fuentedeprrafopredeter"/>
     <w:link w:val="Citadestacada"/>
     <w:uiPriority w:val="30"/>
-    <w:rsid w:val="009628EB"/>
+    <w:rsid w:val="00761970"/>
     <w:rPr>
       <w:i/>
       <w:iCs/>
@@ -7645,7 +7935,7 @@
     <w:basedOn w:val="Fuentedeprrafopredeter"/>
     <w:uiPriority w:val="32"/>
     <w:qFormat/>
-    <w:rsid w:val="009628EB"/>
+    <w:rsid w:val="00761970"/>
     <w:rPr>
       <w:b/>
       <w:bCs/>
@@ -7661,7 +7951,7 @@
     <w:autoRedefine/>
     <w:uiPriority w:val="39"/>
     <w:unhideWhenUsed/>
-    <w:rsid w:val="009628EB"/>
+    <w:rsid w:val="00761970"/>
     <w:pPr>
       <w:spacing w:after="100"/>
     </w:pPr>
@@ -7673,7 +7963,7 @@
     <w:uiPriority w:val="35"/>
     <w:unhideWhenUsed/>
     <w:qFormat/>
-    <w:rsid w:val="009628EB"/>
+    <w:rsid w:val="00761970"/>
     <w:pPr>
       <w:spacing w:after="200" w:line="240" w:lineRule="auto"/>
     </w:pPr>
@@ -7692,7 +7982,7 @@
     <w:autoRedefine/>
     <w:uiPriority w:val="39"/>
     <w:unhideWhenUsed/>
-    <w:rsid w:val="009628EB"/>
+    <w:rsid w:val="00761970"/>
     <w:pPr>
       <w:spacing w:after="100"/>
       <w:ind w:left="220"/>

</xml_diff>

<commit_message>
La documentacion explica una sola forma de abrir la app
Se quito la referencia a la sustentacion y la seccion 4.1 ahora es un
procedimiento paso a paso: instalar Node, levantar la API, comprobar que
responde, instalar el APK, iniciar sesion y verificar que todo quedo
conectado. Lo mismo en el INSTRUCCIONES.md del paquete.
</commit_message>
<xml_diff>
--- a/evidencias/Documentacion-Bolivar-Aprende-y-Trabaja.docx
+++ b/evidencias/Documentacion-Bolivar-Aprende-y-Trabaja.docx
@@ -348,7 +348,7 @@
       <w:pPr>
         <w:pStyle w:val="Ttulo1"/>
       </w:pPr>
-      <w:bookmarkStart w:id="0" w:name="_Toc243907968"/>
+      <w:bookmarkStart w:id="0" w:name="_Toc243909175"/>
       <w:r>
         <w:t>Tabla de contenido</w:t>
       </w:r>
@@ -401,7 +401,7 @@
         <w:rPr>
           <w:noProof/>
         </w:rPr>
-        <w:instrText xml:space="preserve"> PAGEREF _Toc243907968 \h </w:instrText>
+        <w:instrText xml:space="preserve"> PAGEREF _Toc243909175 \h </w:instrText>
       </w:r>
       <w:r>
         <w:rPr>
@@ -465,7 +465,7 @@
         <w:rPr>
           <w:noProof/>
         </w:rPr>
-        <w:instrText xml:space="preserve"> PAGEREF _Toc243907969 \h </w:instrText>
+        <w:instrText xml:space="preserve"> PAGEREF _Toc243909176 \h </w:instrText>
       </w:r>
       <w:r>
         <w:rPr>
@@ -529,7 +529,7 @@
         <w:rPr>
           <w:noProof/>
         </w:rPr>
-        <w:instrText xml:space="preserve"> PAGEREF _Toc243907970 \h </w:instrText>
+        <w:instrText xml:space="preserve"> PAGEREF _Toc243909177 \h </w:instrText>
       </w:r>
       <w:r>
         <w:rPr>
@@ -593,7 +593,7 @@
         <w:rPr>
           <w:noProof/>
         </w:rPr>
-        <w:instrText xml:space="preserve"> PAGEREF _Toc243907971 \h </w:instrText>
+        <w:instrText xml:space="preserve"> PAGEREF _Toc243909178 \h </w:instrText>
       </w:r>
       <w:r>
         <w:rPr>
@@ -651,7 +651,7 @@
         <w:rPr>
           <w:noProof/>
         </w:rPr>
-        <w:instrText xml:space="preserve"> PAGEREF _Toc243907972 \h </w:instrText>
+        <w:instrText xml:space="preserve"> PAGEREF _Toc243909179 \h </w:instrText>
       </w:r>
       <w:r>
         <w:rPr>
@@ -709,7 +709,7 @@
         <w:rPr>
           <w:noProof/>
         </w:rPr>
-        <w:instrText xml:space="preserve"> PAGEREF _Toc243907973 \h </w:instrText>
+        <w:instrText xml:space="preserve"> PAGEREF _Toc243909180 \h </w:instrText>
       </w:r>
       <w:r>
         <w:rPr>
@@ -773,7 +773,7 @@
         <w:rPr>
           <w:noProof/>
         </w:rPr>
-        <w:instrText xml:space="preserve"> PAGEREF _Toc243907974 \h </w:instrText>
+        <w:instrText xml:space="preserve"> PAGEREF _Toc243909181 \h </w:instrText>
       </w:r>
       <w:r>
         <w:rPr>
@@ -813,7 +813,7 @@
         <w:rPr>
           <w:noProof/>
         </w:rPr>
-        <w:t>4.1 Qué tiene que hacer el profesor para ver la app</w:t>
+        <w:t>4.1 Cómo abrir la app y comprobar que funciona</w:t>
       </w:r>
       <w:r>
         <w:rPr>
@@ -831,7 +831,7 @@
         <w:rPr>
           <w:noProof/>
         </w:rPr>
-        <w:instrText xml:space="preserve"> PAGEREF _Toc243907975 \h </w:instrText>
+        <w:instrText xml:space="preserve"> PAGEREF _Toc243909182 \h </w:instrText>
       </w:r>
       <w:r>
         <w:rPr>
@@ -889,7 +889,7 @@
         <w:rPr>
           <w:noProof/>
         </w:rPr>
-        <w:instrText xml:space="preserve"> PAGEREF _Toc243907976 \h </w:instrText>
+        <w:instrText xml:space="preserve"> PAGEREF _Toc243909183 \h </w:instrText>
       </w:r>
       <w:r>
         <w:rPr>
@@ -947,7 +947,7 @@
         <w:rPr>
           <w:noProof/>
         </w:rPr>
-        <w:instrText xml:space="preserve"> PAGEREF _Toc243907977 \h </w:instrText>
+        <w:instrText xml:space="preserve"> PAGEREF _Toc243909184 \h </w:instrText>
       </w:r>
       <w:r>
         <w:rPr>
@@ -1005,7 +1005,7 @@
         <w:rPr>
           <w:noProof/>
         </w:rPr>
-        <w:instrText xml:space="preserve"> PAGEREF _Toc243907978 \h </w:instrText>
+        <w:instrText xml:space="preserve"> PAGEREF _Toc243909185 \h </w:instrText>
       </w:r>
       <w:r>
         <w:rPr>
@@ -1063,7 +1063,7 @@
         <w:rPr>
           <w:noProof/>
         </w:rPr>
-        <w:instrText xml:space="preserve"> PAGEREF _Toc243907979 \h </w:instrText>
+        <w:instrText xml:space="preserve"> PAGEREF _Toc243909186 \h </w:instrText>
       </w:r>
       <w:r>
         <w:rPr>
@@ -1080,7 +1080,7 @@
         <w:rPr>
           <w:noProof/>
         </w:rPr>
-        <w:t>7</w:t>
+        <w:t>8</w:t>
       </w:r>
       <w:r>
         <w:rPr>
@@ -1121,7 +1121,7 @@
         <w:rPr>
           <w:noProof/>
         </w:rPr>
-        <w:instrText xml:space="preserve"> PAGEREF _Toc243907980 \h </w:instrText>
+        <w:instrText xml:space="preserve"> PAGEREF _Toc243909187 \h </w:instrText>
       </w:r>
       <w:r>
         <w:rPr>
@@ -1138,7 +1138,7 @@
         <w:rPr>
           <w:noProof/>
         </w:rPr>
-        <w:t>7</w:t>
+        <w:t>8</w:t>
       </w:r>
       <w:r>
         <w:rPr>
@@ -1185,7 +1185,7 @@
         <w:rPr>
           <w:noProof/>
         </w:rPr>
-        <w:instrText xml:space="preserve"> PAGEREF _Toc243907981 \h </w:instrText>
+        <w:instrText xml:space="preserve"> PAGEREF _Toc243909188 \h </w:instrText>
       </w:r>
       <w:r>
         <w:rPr>
@@ -1249,7 +1249,7 @@
         <w:rPr>
           <w:noProof/>
         </w:rPr>
-        <w:instrText xml:space="preserve"> PAGEREF _Toc243907982 \h </w:instrText>
+        <w:instrText xml:space="preserve"> PAGEREF _Toc243909189 \h </w:instrText>
       </w:r>
       <w:r>
         <w:rPr>
@@ -1313,7 +1313,7 @@
         <w:rPr>
           <w:noProof/>
         </w:rPr>
-        <w:instrText xml:space="preserve"> PAGEREF _Toc243907983 \h </w:instrText>
+        <w:instrText xml:space="preserve"> PAGEREF _Toc243909190 \h </w:instrText>
       </w:r>
       <w:r>
         <w:rPr>
@@ -1330,7 +1330,7 @@
         <w:rPr>
           <w:noProof/>
         </w:rPr>
-        <w:t>9</w:t>
+        <w:t>10</w:t>
       </w:r>
       <w:r>
         <w:rPr>
@@ -1371,7 +1371,7 @@
         <w:rPr>
           <w:noProof/>
         </w:rPr>
-        <w:instrText xml:space="preserve"> PAGEREF _Toc243907984 \h </w:instrText>
+        <w:instrText xml:space="preserve"> PAGEREF _Toc243909191 \h </w:instrText>
       </w:r>
       <w:r>
         <w:rPr>
@@ -1388,7 +1388,7 @@
         <w:rPr>
           <w:noProof/>
         </w:rPr>
-        <w:t>9</w:t>
+        <w:t>10</w:t>
       </w:r>
       <w:r>
         <w:rPr>
@@ -1429,7 +1429,7 @@
         <w:rPr>
           <w:noProof/>
         </w:rPr>
-        <w:instrText xml:space="preserve"> PAGEREF _Toc243907985 \h </w:instrText>
+        <w:instrText xml:space="preserve"> PAGEREF _Toc243909192 \h </w:instrText>
       </w:r>
       <w:r>
         <w:rPr>
@@ -1487,7 +1487,7 @@
         <w:rPr>
           <w:noProof/>
         </w:rPr>
-        <w:instrText xml:space="preserve"> PAGEREF _Toc243907986 \h </w:instrText>
+        <w:instrText xml:space="preserve"> PAGEREF _Toc243909193 \h </w:instrText>
       </w:r>
       <w:r>
         <w:rPr>
@@ -1528,7 +1528,7 @@
       <w:pPr>
         <w:pStyle w:val="Ttulo1"/>
       </w:pPr>
-      <w:bookmarkStart w:id="1" w:name="_Toc243907969"/>
+      <w:bookmarkStart w:id="1" w:name="_Toc243909176"/>
       <w:r>
         <w:t>1. Introducción</w:t>
       </w:r>
@@ -1553,7 +1553,7 @@
       <w:pPr>
         <w:pStyle w:val="Ttulo1"/>
       </w:pPr>
-      <w:bookmarkStart w:id="2" w:name="_Toc243907970"/>
+      <w:bookmarkStart w:id="2" w:name="_Toc243909177"/>
       <w:r>
         <w:t>2. Descripción de la actividad</w:t>
       </w:r>
@@ -1618,9 +1618,8 @@
       <w:pPr>
         <w:pStyle w:val="Ttulo1"/>
       </w:pPr>
-      <w:bookmarkStart w:id="3" w:name="_Toc243907971"/>
-      <w:r>
-        <w:lastRenderedPageBreak/>
+      <w:bookmarkStart w:id="3" w:name="_Toc243909178"/>
+      <w:r>
         <w:t>3. Requisitos</w:t>
       </w:r>
       <w:bookmarkEnd w:id="3"/>
@@ -1629,7 +1628,7 @@
       <w:pPr>
         <w:pStyle w:val="Ttulo2"/>
       </w:pPr>
-      <w:bookmarkStart w:id="4" w:name="_Toc243907972"/>
+      <w:bookmarkStart w:id="4" w:name="_Toc243909179"/>
       <w:r>
         <w:t>3.1 Requisitos funcionales</w:t>
       </w:r>
@@ -2682,7 +2681,6 @@
               <w:rPr>
                 <w:sz w:val="18"/>
               </w:rPr>
-              <w:lastRenderedPageBreak/>
               <w:t>RF16</w:t>
             </w:r>
           </w:p>
@@ -2792,7 +2790,7 @@
       <w:pPr>
         <w:pStyle w:val="Ttulo2"/>
       </w:pPr>
-      <w:bookmarkStart w:id="5" w:name="_Toc243907973"/>
+      <w:bookmarkStart w:id="5" w:name="_Toc243909180"/>
       <w:r>
         <w:t>3.2 Requisitos no funcionales</w:t>
       </w:r>
@@ -3582,9 +3580,8 @@
       <w:pPr>
         <w:pStyle w:val="Ttulo1"/>
       </w:pPr>
-      <w:bookmarkStart w:id="6" w:name="_Toc243907974"/>
-      <w:r>
-        <w:lastRenderedPageBreak/>
+      <w:bookmarkStart w:id="6" w:name="_Toc243909181"/>
+      <w:r>
         <w:t>4. Configuración y puesta en marcha</w:t>
       </w:r>
       <w:bookmarkEnd w:id="6"/>
@@ -3598,15 +3595,25 @@
       <w:pPr>
         <w:pStyle w:val="Ttulo2"/>
       </w:pPr>
-      <w:bookmarkStart w:id="7" w:name="_Toc243907975"/>
-      <w:r>
-        <w:t>4.1 Qué tiene que hacer el profesor para ver la app</w:t>
+      <w:bookmarkStart w:id="7" w:name="_Toc243909182"/>
+      <w:r>
+        <w:t>4.1 Cómo abrir la app y comprobar que funciona</w:t>
       </w:r>
       <w:bookmarkEnd w:id="7"/>
     </w:p>
     <w:p>
       <w:r>
-        <w:t>La aplicación no tiene base de datos propia: necesita la API encendida. Hay tres formas de dejarlo funcionando:</w:t>
+        <w:t>La aplicación no tiene base de datos propia: todo lo que muestra viene de la API. Por eso, para abrirla y ver que funciona hay que tener la API encendida y el APK instalado. Son estos pasos:</w:t>
+      </w:r>
+    </w:p>
+    <w:p>
+      <w:r>
+        <w:t>Paso 1. Instalar Node.js 18 o superior (https://nodejs.org).</w:t>
+      </w:r>
+    </w:p>
+    <w:p>
+      <w:r>
+        <w:t>Paso 2. Levantar la API. En una terminal, dentro de la carpeta backend:</w:t>
       </w:r>
     </w:p>
     <w:p>
@@ -3614,7 +3621,7 @@
         <w:pStyle w:val="Prrafodelista"/>
       </w:pPr>
       <w:r>
-        <w:t>Forma A — En la sustentación, en el salón: con el backend encendido en el equipo (npm start) y el celular del profesor en la misma red Wi-Fi. El APK ya viene con la dirección de ese equipo, así que la app se conecta sola y muestra el chip verde "API conectada". Si el equipo cambia de red, basta con tocar "Reintentar" en la app.</w:t>
+        <w:t>cp .env.example .env        (en Windows: copy .env.example .env)</w:t>
       </w:r>
     </w:p>
     <w:p>
@@ -3622,7 +3629,7 @@
         <w:pStyle w:val="Prrafodelista"/>
       </w:pPr>
       <w:r>
-        <w:t>Forma B — En la casa del profesor, con el código: instala Node.js 18 o superior, descomprime el paquete, entra a la carpeta backend, copia .env.example como .env y pega el valor de MONGO_URI, y ejecuta npm install, npm run seed y npm start. Después instala el APK: en el emulador de Android Studio funciona directo, y en un celular físico toca el botón "Servidor: ..." de la pantalla de inicio de sesión y escribe la dirección de su computador (por ejemplo http://192.168.1.50:4000/api). La app la recuerda.</w:t>
+        <w:t>Editar el archivo .env y pegar el valor de MONGO_URI que viene en el archivo conexion-base-de-datos.txt del paquete.</w:t>
       </w:r>
     </w:p>
     <w:p>
@@ -3630,14 +3637,71 @@
         <w:pStyle w:val="Prrafodelista"/>
       </w:pPr>
       <w:r>
-        <w:t>Forma C — Desde cualquier parte del mundo: publicar la API en internet (gratis) y recompilar el APK apuntando a esa dirección pública. El proceso está explicado en el README del proyecto.</w:t>
+        <w:t>npm install</w:t>
+      </w:r>
+    </w:p>
+    <w:p>
+      <w:pPr>
+        <w:pStyle w:val="Prrafodelista"/>
+      </w:pPr>
+      <w:r>
+        <w:t>npm run seed                (crea el administrador: admin@bolivar.com / admin123)</w:t>
+      </w:r>
+    </w:p>
+    <w:p>
+      <w:pPr>
+        <w:pStyle w:val="Prrafodelista"/>
+      </w:pPr>
+      <w:r>
+        <w:t>npm start                   (la API queda escuchando en el puerto 4000)</w:t>
+      </w:r>
+    </w:p>
+    <w:p>
+      <w:r>
+        <w:t>Paso 3. Comprobar que la API está viva. En el navegador debe abrir http://localhost:4000/api/salud y mostrar: {"estado":"ok"}. (La primera vez tarda unos 40 segundos, porque la base de datos está en Atlas y la conexión es por internet.)</w:t>
+      </w:r>
+    </w:p>
+    <w:p>
+      <w:r>
+        <w:t>Paso 4. Abrir la aplicación. Hay dos opciones:</w:t>
+      </w:r>
+    </w:p>
+    <w:p>
+      <w:pPr>
+        <w:pStyle w:val="Prrafodelista"/>
+      </w:pPr>
+      <w:r>
+        <w:t>Instalar el APK (app-release.apk) en un celular Android: se le pasa el archivo, en el celular se va a Ajustes → Aplicaciones → acceso especial → Instalar aplicaciones desconocidas, se activa la app desde donde se abre el archivo, y luego se abre el APK y se le da a Instalar.</w:t>
+      </w:r>
+    </w:p>
+    <w:p>
+      <w:pPr>
+        <w:pStyle w:val="Prrafodelista"/>
+      </w:pPr>
+      <w:r>
+        <w:t>O bien abrir el proyecto en Android Studio (carpeta bolivar_aprende_y_trabaja) y darle al botón Run, que abre el emulador.</w:t>
+      </w:r>
+    </w:p>
+    <w:p>
+      <w:r>
+        <w:t>Paso 5. Iniciar sesión con el administrador: admin@bolivar.com y contraseña admin123.</w:t>
+      </w:r>
+    </w:p>
+    <w:p>
+      <w:r>
+        <w:t>Paso 6. Comprobar que todo está conectado. En el menú lateral se entra a "Gestión de datos": debe aparecer el chip verde "API conectada" y el listado de oportunidades que están guardadas en MongoDB. Si se crea una nueva, esta queda en la base de datos y aparece en el listado del inicio: ese es el ciclo completo de la API.</w:t>
+      </w:r>
+    </w:p>
+    <w:p>
+      <w:r>
+        <w:t>Si la aplicación se abre en un celular físico y sale el aviso "Sin conexión con el servidor", es porque el celular tiene que buscar la API en la red local. En ese caso, en la pantalla de inicio de sesión se toca el botón "Servidor: ..." y se escribe la dirección del computador donde está la API, por ejemplo http://192.168.1.50:4000/api (el celular y el computador deben estar en la misma red). La aplicación la recuerda y las demás veces entra directo. En el emulador de Android Studio no hace falta nada de esto, porque ya apunta al localhost del computador.</w:t>
       </w:r>
     </w:p>
     <w:p>
       <w:pPr>
         <w:pStyle w:val="Ttulo2"/>
       </w:pPr>
-      <w:bookmarkStart w:id="8" w:name="_Toc243907976"/>
+      <w:bookmarkStart w:id="8" w:name="_Toc243909183"/>
       <w:r>
         <w:t>4.2 Levantar la API</w:t>
       </w:r>
@@ -4096,7 +4160,7 @@
       <w:pPr>
         <w:pStyle w:val="Ttulo2"/>
       </w:pPr>
-      <w:bookmarkStart w:id="9" w:name="_Toc243907977"/>
+      <w:bookmarkStart w:id="9" w:name="_Toc243909184"/>
       <w:r>
         <w:t>4.3 Correr la aplicación</w:t>
       </w:r>
@@ -4132,7 +4196,7 @@
       <w:pPr>
         <w:pStyle w:val="Ttulo2"/>
       </w:pPr>
-      <w:bookmarkStart w:id="10" w:name="_Toc243907978"/>
+      <w:bookmarkStart w:id="10" w:name="_Toc243909185"/>
       <w:r>
         <w:t>4.4 Compilar el APK de entrega</w:t>
       </w:r>
@@ -4155,7 +4219,7 @@
       <w:pPr>
         <w:pStyle w:val="Ttulo2"/>
       </w:pPr>
-      <w:bookmarkStart w:id="11" w:name="_Toc243907979"/>
+      <w:bookmarkStart w:id="11" w:name="_Toc243909186"/>
       <w:r>
         <w:t>4.5 Instalar el APK en un celular</w:t>
       </w:r>
@@ -4194,7 +4258,7 @@
       <w:pPr>
         <w:pStyle w:val="Ttulo2"/>
       </w:pPr>
-      <w:bookmarkStart w:id="12" w:name="_Toc243907980"/>
+      <w:bookmarkStart w:id="12" w:name="_Toc243909187"/>
       <w:r>
         <w:t>4.6 Pruebas</w:t>
       </w:r>
@@ -4731,7 +4795,7 @@
       <w:pPr>
         <w:pStyle w:val="Ttulo1"/>
       </w:pPr>
-      <w:bookmarkStart w:id="13" w:name="_Toc243907981"/>
+      <w:bookmarkStart w:id="13" w:name="_Toc243909188"/>
       <w:r>
         <w:t>5. Resultados</w:t>
       </w:r>
@@ -5100,7 +5164,7 @@
       <w:pPr>
         <w:pStyle w:val="Ttulo1"/>
       </w:pPr>
-      <w:bookmarkStart w:id="14" w:name="_Toc243907982"/>
+      <w:bookmarkStart w:id="14" w:name="_Toc243909189"/>
       <w:r>
         <w:t>6. Conclusiones</w:t>
       </w:r>
@@ -5130,7 +5194,7 @@
       <w:pPr>
         <w:pStyle w:val="Ttulo1"/>
       </w:pPr>
-      <w:bookmarkStart w:id="15" w:name="_Toc243907983"/>
+      <w:bookmarkStart w:id="15" w:name="_Toc243909190"/>
       <w:r>
         <w:t>7. Anexo</w:t>
       </w:r>
@@ -5140,7 +5204,7 @@
       <w:pPr>
         <w:pStyle w:val="Ttulo2"/>
       </w:pPr>
-      <w:bookmarkStart w:id="16" w:name="_Toc243907984"/>
+      <w:bookmarkStart w:id="16" w:name="_Toc243909191"/>
       <w:r>
         <w:t>7.1 Enlaces</w:t>
       </w:r>
@@ -5486,7 +5550,7 @@
       <w:pPr>
         <w:pStyle w:val="Ttulo2"/>
       </w:pPr>
-      <w:bookmarkStart w:id="17" w:name="_Toc243907985"/>
+      <w:bookmarkStart w:id="17" w:name="_Toc243909192"/>
       <w:r>
         <w:t>7.2 Contenido del paquete de entrega</w:t>
       </w:r>
@@ -5689,7 +5753,7 @@
               <w:rPr>
                 <w:sz w:val="18"/>
               </w:rPr>
-              <w:t>Resumen: las 3 formas de ver la app y cómo instalar el APK.</w:t>
+              <w:t>Resumen: cómo abrir la app y cómo instalar el APK.</w:t>
             </w:r>
           </w:p>
         </w:tc>
@@ -5876,7 +5940,7 @@
       <w:pPr>
         <w:pStyle w:val="Ttulo2"/>
       </w:pPr>
-      <w:bookmarkStart w:id="18" w:name="_Toc243907986"/>
+      <w:bookmarkStart w:id="18" w:name="_Toc243909193"/>
       <w:r>
         <w:t>7.3 Estructura del proyecto</w:t>
       </w:r>
@@ -6620,10 +6684,10 @@
           <w:noProof/>
         </w:rPr>
         <w:drawing>
-          <wp:inline distT="0" distB="0" distL="0" distR="0" wp14:anchorId="47E7350D" wp14:editId="4A375F11">
+          <wp:inline distT="0" distB="0" distL="0" distR="0" wp14:anchorId="05C410E4" wp14:editId="46C5D060">
             <wp:extent cx="4318000" cy="9355307"/>
             <wp:effectExtent l="0" t="0" r="6350" b="0"/>
-            <wp:docPr id="1369461446" name="Imagen 1"/>
+            <wp:docPr id="1968033975" name="Imagen 1"/>
             <wp:cNvGraphicFramePr>
               <a:graphicFrameLocks xmlns:a="http://schemas.openxmlformats.org/drawingml/2006/main" noChangeAspect="1"/>
             </wp:cNvGraphicFramePr>
@@ -6631,7 +6695,7 @@
               <a:graphicData uri="http://schemas.openxmlformats.org/drawingml/2006/picture">
                 <pic:pic xmlns:pic="http://schemas.openxmlformats.org/drawingml/2006/picture">
                   <pic:nvPicPr>
-                    <pic:cNvPr id="1369461446" name=""/>
+                    <pic:cNvPr id="1968033975" name=""/>
                     <pic:cNvPicPr/>
                   </pic:nvPicPr>
                   <pic:blipFill>
@@ -6678,10 +6742,10 @@
           <w:noProof/>
         </w:rPr>
         <w:drawing>
-          <wp:inline distT="0" distB="0" distL="0" distR="0" wp14:anchorId="3A732558" wp14:editId="18889135">
+          <wp:inline distT="0" distB="0" distL="0" distR="0" wp14:anchorId="6B8F279C" wp14:editId="3FE17156">
             <wp:extent cx="4318000" cy="9355307"/>
             <wp:effectExtent l="0" t="0" r="6350" b="0"/>
-            <wp:docPr id="159713808" name="Imagen 2"/>
+            <wp:docPr id="707043681" name="Imagen 2"/>
             <wp:cNvGraphicFramePr>
               <a:graphicFrameLocks xmlns:a="http://schemas.openxmlformats.org/drawingml/2006/main" noChangeAspect="1"/>
             </wp:cNvGraphicFramePr>
@@ -6689,7 +6753,7 @@
               <a:graphicData uri="http://schemas.openxmlformats.org/drawingml/2006/picture">
                 <pic:pic xmlns:pic="http://schemas.openxmlformats.org/drawingml/2006/picture">
                   <pic:nvPicPr>
-                    <pic:cNvPr id="159713808" name=""/>
+                    <pic:cNvPr id="707043681" name=""/>
                     <pic:cNvPicPr/>
                   </pic:nvPicPr>
                   <pic:blipFill>
@@ -6736,10 +6800,10 @@
           <w:noProof/>
         </w:rPr>
         <w:drawing>
-          <wp:inline distT="0" distB="0" distL="0" distR="0" wp14:anchorId="3E433DFA" wp14:editId="7D49EFFC">
+          <wp:inline distT="0" distB="0" distL="0" distR="0" wp14:anchorId="1027CE28" wp14:editId="1C7B43B6">
             <wp:extent cx="4318000" cy="9355307"/>
             <wp:effectExtent l="0" t="0" r="6350" b="0"/>
-            <wp:docPr id="1378701793" name="Imagen 3"/>
+            <wp:docPr id="2128959709" name="Imagen 3"/>
             <wp:cNvGraphicFramePr>
               <a:graphicFrameLocks xmlns:a="http://schemas.openxmlformats.org/drawingml/2006/main" noChangeAspect="1"/>
             </wp:cNvGraphicFramePr>
@@ -6747,7 +6811,7 @@
               <a:graphicData uri="http://schemas.openxmlformats.org/drawingml/2006/picture">
                 <pic:pic xmlns:pic="http://schemas.openxmlformats.org/drawingml/2006/picture">
                   <pic:nvPicPr>
-                    <pic:cNvPr id="1378701793" name=""/>
+                    <pic:cNvPr id="2128959709" name=""/>
                     <pic:cNvPicPr/>
                   </pic:nvPicPr>
                   <pic:blipFill>
@@ -6794,10 +6858,10 @@
           <w:noProof/>
         </w:rPr>
         <w:drawing>
-          <wp:inline distT="0" distB="0" distL="0" distR="0" wp14:anchorId="4E8605FB" wp14:editId="58B6F10A">
+          <wp:inline distT="0" distB="0" distL="0" distR="0" wp14:anchorId="4FBF20A3" wp14:editId="35A1D529">
             <wp:extent cx="4318000" cy="9355307"/>
             <wp:effectExtent l="0" t="0" r="6350" b="0"/>
-            <wp:docPr id="1346460803" name="Imagen 4"/>
+            <wp:docPr id="1469937177" name="Imagen 4"/>
             <wp:cNvGraphicFramePr>
               <a:graphicFrameLocks xmlns:a="http://schemas.openxmlformats.org/drawingml/2006/main" noChangeAspect="1"/>
             </wp:cNvGraphicFramePr>
@@ -6805,7 +6869,7 @@
               <a:graphicData uri="http://schemas.openxmlformats.org/drawingml/2006/picture">
                 <pic:pic xmlns:pic="http://schemas.openxmlformats.org/drawingml/2006/picture">
                   <pic:nvPicPr>
-                    <pic:cNvPr id="1346460803" name=""/>
+                    <pic:cNvPr id="1469937177" name=""/>
                     <pic:cNvPicPr/>
                   </pic:nvPicPr>
                   <pic:blipFill>
@@ -6852,10 +6916,10 @@
           <w:noProof/>
         </w:rPr>
         <w:drawing>
-          <wp:inline distT="0" distB="0" distL="0" distR="0" wp14:anchorId="26CC987A" wp14:editId="314C571E">
+          <wp:inline distT="0" distB="0" distL="0" distR="0" wp14:anchorId="76371A2D" wp14:editId="7D07F729">
             <wp:extent cx="4318000" cy="9355307"/>
             <wp:effectExtent l="0" t="0" r="6350" b="0"/>
-            <wp:docPr id="184000825" name="Imagen 5"/>
+            <wp:docPr id="222899343" name="Imagen 5"/>
             <wp:cNvGraphicFramePr>
               <a:graphicFrameLocks xmlns:a="http://schemas.openxmlformats.org/drawingml/2006/main" noChangeAspect="1"/>
             </wp:cNvGraphicFramePr>
@@ -6863,7 +6927,7 @@
               <a:graphicData uri="http://schemas.openxmlformats.org/drawingml/2006/picture">
                 <pic:pic xmlns:pic="http://schemas.openxmlformats.org/drawingml/2006/picture">
                   <pic:nvPicPr>
-                    <pic:cNvPr id="184000825" name=""/>
+                    <pic:cNvPr id="222899343" name=""/>
                     <pic:cNvPicPr/>
                   </pic:nvPicPr>
                   <pic:blipFill>
@@ -6910,10 +6974,10 @@
           <w:noProof/>
         </w:rPr>
         <w:drawing>
-          <wp:inline distT="0" distB="0" distL="0" distR="0" wp14:anchorId="08764DFC" wp14:editId="7AF2023A">
+          <wp:inline distT="0" distB="0" distL="0" distR="0" wp14:anchorId="5255AFE8" wp14:editId="2786E4E5">
             <wp:extent cx="4318000" cy="9355307"/>
             <wp:effectExtent l="0" t="0" r="6350" b="0"/>
-            <wp:docPr id="1904279758" name="Imagen 6"/>
+            <wp:docPr id="1405416716" name="Imagen 6"/>
             <wp:cNvGraphicFramePr>
               <a:graphicFrameLocks xmlns:a="http://schemas.openxmlformats.org/drawingml/2006/main" noChangeAspect="1"/>
             </wp:cNvGraphicFramePr>
@@ -6921,7 +6985,7 @@
               <a:graphicData uri="http://schemas.openxmlformats.org/drawingml/2006/picture">
                 <pic:pic xmlns:pic="http://schemas.openxmlformats.org/drawingml/2006/picture">
                   <pic:nvPicPr>
-                    <pic:cNvPr id="1904279758" name=""/>
+                    <pic:cNvPr id="1405416716" name=""/>
                     <pic:cNvPicPr/>
                   </pic:nvPicPr>
                   <pic:blipFill>
@@ -6968,10 +7032,10 @@
           <w:noProof/>
         </w:rPr>
         <w:drawing>
-          <wp:inline distT="0" distB="0" distL="0" distR="0" wp14:anchorId="40F642ED" wp14:editId="013B00AA">
+          <wp:inline distT="0" distB="0" distL="0" distR="0" wp14:anchorId="711074BE" wp14:editId="42DF18DA">
             <wp:extent cx="4318000" cy="3626182"/>
             <wp:effectExtent l="0" t="0" r="6350" b="0"/>
-            <wp:docPr id="1623560945" name="Imagen 7"/>
+            <wp:docPr id="757816359" name="Imagen 7"/>
             <wp:cNvGraphicFramePr>
               <a:graphicFrameLocks xmlns:a="http://schemas.openxmlformats.org/drawingml/2006/main" noChangeAspect="1"/>
             </wp:cNvGraphicFramePr>
@@ -6979,7 +7043,7 @@
               <a:graphicData uri="http://schemas.openxmlformats.org/drawingml/2006/picture">
                 <pic:pic xmlns:pic="http://schemas.openxmlformats.org/drawingml/2006/picture">
                   <pic:nvPicPr>
-                    <pic:cNvPr id="1623560945" name=""/>
+                    <pic:cNvPr id="757816359" name=""/>
                     <pic:cNvPicPr/>
                   </pic:nvPicPr>
                   <pic:blipFill>
@@ -7437,7 +7501,7 @@
     <w:link w:val="Ttulo1Car"/>
     <w:uiPriority w:val="9"/>
     <w:qFormat/>
-    <w:rsid w:val="00761970"/>
+    <w:rsid w:val="001E55CE"/>
     <w:pPr>
       <w:keepNext/>
       <w:keepLines/>
@@ -7459,7 +7523,7 @@
     <w:uiPriority w:val="9"/>
     <w:unhideWhenUsed/>
     <w:qFormat/>
-    <w:rsid w:val="00761970"/>
+    <w:rsid w:val="001E55CE"/>
     <w:pPr>
       <w:keepNext/>
       <w:keepLines/>
@@ -7482,7 +7546,7 @@
     <w:semiHidden/>
     <w:unhideWhenUsed/>
     <w:qFormat/>
-    <w:rsid w:val="00761970"/>
+    <w:rsid w:val="001E55CE"/>
     <w:pPr>
       <w:keepNext/>
       <w:keepLines/>
@@ -7505,7 +7569,7 @@
     <w:semiHidden/>
     <w:unhideWhenUsed/>
     <w:qFormat/>
-    <w:rsid w:val="00761970"/>
+    <w:rsid w:val="001E55CE"/>
     <w:pPr>
       <w:keepNext/>
       <w:keepLines/>
@@ -7528,7 +7592,7 @@
     <w:semiHidden/>
     <w:unhideWhenUsed/>
     <w:qFormat/>
-    <w:rsid w:val="00761970"/>
+    <w:rsid w:val="001E55CE"/>
     <w:pPr>
       <w:keepNext/>
       <w:keepLines/>
@@ -7549,7 +7613,7 @@
     <w:semiHidden/>
     <w:unhideWhenUsed/>
     <w:qFormat/>
-    <w:rsid w:val="00761970"/>
+    <w:rsid w:val="001E55CE"/>
     <w:pPr>
       <w:keepNext/>
       <w:keepLines/>
@@ -7572,7 +7636,7 @@
     <w:semiHidden/>
     <w:unhideWhenUsed/>
     <w:qFormat/>
-    <w:rsid w:val="00761970"/>
+    <w:rsid w:val="001E55CE"/>
     <w:pPr>
       <w:keepNext/>
       <w:keepLines/>
@@ -7593,7 +7657,7 @@
     <w:semiHidden/>
     <w:unhideWhenUsed/>
     <w:qFormat/>
-    <w:rsid w:val="00761970"/>
+    <w:rsid w:val="001E55CE"/>
     <w:pPr>
       <w:keepNext/>
       <w:keepLines/>
@@ -7616,7 +7680,7 @@
     <w:semiHidden/>
     <w:unhideWhenUsed/>
     <w:qFormat/>
-    <w:rsid w:val="00761970"/>
+    <w:rsid w:val="001E55CE"/>
     <w:pPr>
       <w:keepNext/>
       <w:keepLines/>
@@ -7660,7 +7724,7 @@
     <w:basedOn w:val="Fuentedeprrafopredeter"/>
     <w:link w:val="Ttulo1"/>
     <w:uiPriority w:val="9"/>
-    <w:rsid w:val="00761970"/>
+    <w:rsid w:val="001E55CE"/>
     <w:rPr>
       <w:rFonts w:asciiTheme="majorHAnsi" w:eastAsiaTheme="majorEastAsia" w:hAnsiTheme="majorHAnsi" w:cstheme="majorBidi"/>
       <w:color w:val="2F5496" w:themeColor="accent1" w:themeShade="BF"/>
@@ -7673,7 +7737,7 @@
     <w:basedOn w:val="Fuentedeprrafopredeter"/>
     <w:link w:val="Ttulo2"/>
     <w:uiPriority w:val="9"/>
-    <w:rsid w:val="00761970"/>
+    <w:rsid w:val="001E55CE"/>
     <w:rPr>
       <w:rFonts w:asciiTheme="majorHAnsi" w:eastAsiaTheme="majorEastAsia" w:hAnsiTheme="majorHAnsi" w:cstheme="majorBidi"/>
       <w:color w:val="2F5496" w:themeColor="accent1" w:themeShade="BF"/>
@@ -7687,7 +7751,7 @@
     <w:link w:val="Ttulo3"/>
     <w:uiPriority w:val="9"/>
     <w:semiHidden/>
-    <w:rsid w:val="00761970"/>
+    <w:rsid w:val="001E55CE"/>
     <w:rPr>
       <w:rFonts w:eastAsiaTheme="majorEastAsia" w:cstheme="majorBidi"/>
       <w:color w:val="2F5496" w:themeColor="accent1" w:themeShade="BF"/>
@@ -7701,7 +7765,7 @@
     <w:link w:val="Ttulo4"/>
     <w:uiPriority w:val="9"/>
     <w:semiHidden/>
-    <w:rsid w:val="00761970"/>
+    <w:rsid w:val="001E55CE"/>
     <w:rPr>
       <w:rFonts w:eastAsiaTheme="majorEastAsia" w:cstheme="majorBidi"/>
       <w:i/>
@@ -7715,7 +7779,7 @@
     <w:link w:val="Ttulo5"/>
     <w:uiPriority w:val="9"/>
     <w:semiHidden/>
-    <w:rsid w:val="00761970"/>
+    <w:rsid w:val="001E55CE"/>
     <w:rPr>
       <w:rFonts w:eastAsiaTheme="majorEastAsia" w:cstheme="majorBidi"/>
       <w:color w:val="2F5496" w:themeColor="accent1" w:themeShade="BF"/>
@@ -7727,7 +7791,7 @@
     <w:link w:val="Ttulo6"/>
     <w:uiPriority w:val="9"/>
     <w:semiHidden/>
-    <w:rsid w:val="00761970"/>
+    <w:rsid w:val="001E55CE"/>
     <w:rPr>
       <w:rFonts w:eastAsiaTheme="majorEastAsia" w:cstheme="majorBidi"/>
       <w:i/>
@@ -7741,7 +7805,7 @@
     <w:link w:val="Ttulo7"/>
     <w:uiPriority w:val="9"/>
     <w:semiHidden/>
-    <w:rsid w:val="00761970"/>
+    <w:rsid w:val="001E55CE"/>
     <w:rPr>
       <w:rFonts w:eastAsiaTheme="majorEastAsia" w:cstheme="majorBidi"/>
       <w:color w:val="595959" w:themeColor="text1" w:themeTint="A6"/>
@@ -7753,7 +7817,7 @@
     <w:link w:val="Ttulo8"/>
     <w:uiPriority w:val="9"/>
     <w:semiHidden/>
-    <w:rsid w:val="00761970"/>
+    <w:rsid w:val="001E55CE"/>
     <w:rPr>
       <w:rFonts w:eastAsiaTheme="majorEastAsia" w:cstheme="majorBidi"/>
       <w:i/>
@@ -7767,7 +7831,7 @@
     <w:link w:val="Ttulo9"/>
     <w:uiPriority w:val="9"/>
     <w:semiHidden/>
-    <w:rsid w:val="00761970"/>
+    <w:rsid w:val="001E55CE"/>
     <w:rPr>
       <w:rFonts w:eastAsiaTheme="majorEastAsia" w:cstheme="majorBidi"/>
       <w:color w:val="272727" w:themeColor="text1" w:themeTint="D8"/>
@@ -7780,7 +7844,7 @@
     <w:link w:val="TtuloCar"/>
     <w:uiPriority w:val="10"/>
     <w:qFormat/>
-    <w:rsid w:val="00761970"/>
+    <w:rsid w:val="001E55CE"/>
     <w:pPr>
       <w:spacing w:after="80" w:line="240" w:lineRule="auto"/>
       <w:contextualSpacing/>
@@ -7798,7 +7862,7 @@
     <w:basedOn w:val="Fuentedeprrafopredeter"/>
     <w:link w:val="Ttulo"/>
     <w:uiPriority w:val="10"/>
-    <w:rsid w:val="00761970"/>
+    <w:rsid w:val="001E55CE"/>
     <w:rPr>
       <w:rFonts w:asciiTheme="majorHAnsi" w:eastAsiaTheme="majorEastAsia" w:hAnsiTheme="majorHAnsi" w:cstheme="majorBidi"/>
       <w:spacing w:val="-10"/>
@@ -7814,7 +7878,7 @@
     <w:link w:val="SubttuloCar"/>
     <w:uiPriority w:val="11"/>
     <w:qFormat/>
-    <w:rsid w:val="00761970"/>
+    <w:rsid w:val="001E55CE"/>
     <w:pPr>
       <w:numPr>
         <w:ilvl w:val="1"/>
@@ -7833,7 +7897,7 @@
     <w:basedOn w:val="Fuentedeprrafopredeter"/>
     <w:link w:val="Subttulo"/>
     <w:uiPriority w:val="11"/>
-    <w:rsid w:val="00761970"/>
+    <w:rsid w:val="001E55CE"/>
     <w:rPr>
       <w:rFonts w:eastAsiaTheme="majorEastAsia" w:cstheme="majorBidi"/>
       <w:color w:val="595959" w:themeColor="text1" w:themeTint="A6"/>
@@ -7849,7 +7913,7 @@
     <w:link w:val="CitaCar"/>
     <w:uiPriority w:val="29"/>
     <w:qFormat/>
-    <w:rsid w:val="00761970"/>
+    <w:rsid w:val="001E55CE"/>
     <w:pPr>
       <w:spacing w:before="160"/>
       <w:jc w:val="center"/>
@@ -7865,7 +7929,7 @@
     <w:basedOn w:val="Fuentedeprrafopredeter"/>
     <w:link w:val="Cita"/>
     <w:uiPriority w:val="29"/>
-    <w:rsid w:val="00761970"/>
+    <w:rsid w:val="001E55CE"/>
     <w:rPr>
       <w:i/>
       <w:iCs/>
@@ -7877,7 +7941,7 @@
     <w:basedOn w:val="Normal"/>
     <w:uiPriority w:val="34"/>
     <w:qFormat/>
-    <w:rsid w:val="00761970"/>
+    <w:rsid w:val="001E55CE"/>
     <w:pPr>
       <w:ind w:left="720"/>
       <w:contextualSpacing/>
@@ -7888,7 +7952,7 @@
     <w:basedOn w:val="Fuentedeprrafopredeter"/>
     <w:uiPriority w:val="21"/>
     <w:qFormat/>
-    <w:rsid w:val="00761970"/>
+    <w:rsid w:val="001E55CE"/>
     <w:rPr>
       <w:i/>
       <w:iCs/>
@@ -7902,7 +7966,7 @@
     <w:link w:val="CitadestacadaCar"/>
     <w:uiPriority w:val="30"/>
     <w:qFormat/>
-    <w:rsid w:val="00761970"/>
+    <w:rsid w:val="001E55CE"/>
     <w:pPr>
       <w:pBdr>
         <w:top w:val="single" w:sz="4" w:space="10" w:color="2F5496" w:themeColor="accent1" w:themeShade="BF"/>
@@ -7923,7 +7987,7 @@
     <w:basedOn w:val="Fuentedeprrafopredeter"/>
     <w:link w:val="Citadestacada"/>
     <w:uiPriority w:val="30"/>
-    <w:rsid w:val="00761970"/>
+    <w:rsid w:val="001E55CE"/>
     <w:rPr>
       <w:i/>
       <w:iCs/>
@@ -7935,7 +7999,7 @@
     <w:basedOn w:val="Fuentedeprrafopredeter"/>
     <w:uiPriority w:val="32"/>
     <w:qFormat/>
-    <w:rsid w:val="00761970"/>
+    <w:rsid w:val="001E55CE"/>
     <w:rPr>
       <w:b/>
       <w:bCs/>
@@ -7951,7 +8015,7 @@
     <w:autoRedefine/>
     <w:uiPriority w:val="39"/>
     <w:unhideWhenUsed/>
-    <w:rsid w:val="00761970"/>
+    <w:rsid w:val="001E55CE"/>
     <w:pPr>
       <w:spacing w:after="100"/>
     </w:pPr>
@@ -7963,7 +8027,7 @@
     <w:uiPriority w:val="35"/>
     <w:unhideWhenUsed/>
     <w:qFormat/>
-    <w:rsid w:val="00761970"/>
+    <w:rsid w:val="001E55CE"/>
     <w:pPr>
       <w:spacing w:after="200" w:line="240" w:lineRule="auto"/>
     </w:pPr>
@@ -7982,7 +8046,7 @@
     <w:autoRedefine/>
     <w:uiPriority w:val="39"/>
     <w:unhideWhenUsed/>
-    <w:rsid w:val="00761970"/>
+    <w:rsid w:val="001E55CE"/>
     <w:pPr>
       <w:spacing w:after="100"/>
       <w:ind w:left="220"/>

</xml_diff>

<commit_message>
Encender la API con un doble clic: INICIAR-API.bat
El paquete ahora trae un INICIAR-API.bat que crea la configuracion, instala
las dependencias, crea el administrador y enciende el servidor. Se probo
desde un paquete recien descomprimido y la API quedo respondiendo.

Se agrega .npmrc con legacy-peer-deps porque si no, npm install fallaba por
el conflicto de peer dependencies entre newman y newman-reporter-html.
</commit_message>
<xml_diff>
--- a/evidencias/Documentacion-Bolivar-Aprende-y-Trabaja.docx
+++ b/evidencias/Documentacion-Bolivar-Aprende-y-Trabaja.docx
@@ -348,7 +348,7 @@
       <w:pPr>
         <w:pStyle w:val="Ttulo1"/>
       </w:pPr>
-      <w:bookmarkStart w:id="0" w:name="_Toc243909175"/>
+      <w:bookmarkStart w:id="0" w:name="_Toc243909561"/>
       <w:r>
         <w:t>Tabla de contenido</w:t>
       </w:r>
@@ -401,7 +401,7 @@
         <w:rPr>
           <w:noProof/>
         </w:rPr>
-        <w:instrText xml:space="preserve"> PAGEREF _Toc243909175 \h </w:instrText>
+        <w:instrText xml:space="preserve"> PAGEREF _Toc243909561 \h </w:instrText>
       </w:r>
       <w:r>
         <w:rPr>
@@ -465,7 +465,7 @@
         <w:rPr>
           <w:noProof/>
         </w:rPr>
-        <w:instrText xml:space="preserve"> PAGEREF _Toc243909176 \h </w:instrText>
+        <w:instrText xml:space="preserve"> PAGEREF _Toc243909562 \h </w:instrText>
       </w:r>
       <w:r>
         <w:rPr>
@@ -529,7 +529,7 @@
         <w:rPr>
           <w:noProof/>
         </w:rPr>
-        <w:instrText xml:space="preserve"> PAGEREF _Toc243909177 \h </w:instrText>
+        <w:instrText xml:space="preserve"> PAGEREF _Toc243909563 \h </w:instrText>
       </w:r>
       <w:r>
         <w:rPr>
@@ -593,7 +593,7 @@
         <w:rPr>
           <w:noProof/>
         </w:rPr>
-        <w:instrText xml:space="preserve"> PAGEREF _Toc243909178 \h </w:instrText>
+        <w:instrText xml:space="preserve"> PAGEREF _Toc243909564 \h </w:instrText>
       </w:r>
       <w:r>
         <w:rPr>
@@ -651,7 +651,7 @@
         <w:rPr>
           <w:noProof/>
         </w:rPr>
-        <w:instrText xml:space="preserve"> PAGEREF _Toc243909179 \h </w:instrText>
+        <w:instrText xml:space="preserve"> PAGEREF _Toc243909565 \h </w:instrText>
       </w:r>
       <w:r>
         <w:rPr>
@@ -709,7 +709,7 @@
         <w:rPr>
           <w:noProof/>
         </w:rPr>
-        <w:instrText xml:space="preserve"> PAGEREF _Toc243909180 \h </w:instrText>
+        <w:instrText xml:space="preserve"> PAGEREF _Toc243909566 \h </w:instrText>
       </w:r>
       <w:r>
         <w:rPr>
@@ -773,7 +773,7 @@
         <w:rPr>
           <w:noProof/>
         </w:rPr>
-        <w:instrText xml:space="preserve"> PAGEREF _Toc243909181 \h </w:instrText>
+        <w:instrText xml:space="preserve"> PAGEREF _Toc243909567 \h </w:instrText>
       </w:r>
       <w:r>
         <w:rPr>
@@ -831,7 +831,7 @@
         <w:rPr>
           <w:noProof/>
         </w:rPr>
-        <w:instrText xml:space="preserve"> PAGEREF _Toc243909182 \h </w:instrText>
+        <w:instrText xml:space="preserve"> PAGEREF _Toc243909568 \h </w:instrText>
       </w:r>
       <w:r>
         <w:rPr>
@@ -889,7 +889,7 @@
         <w:rPr>
           <w:noProof/>
         </w:rPr>
-        <w:instrText xml:space="preserve"> PAGEREF _Toc243909183 \h </w:instrText>
+        <w:instrText xml:space="preserve"> PAGEREF _Toc243909569 \h </w:instrText>
       </w:r>
       <w:r>
         <w:rPr>
@@ -947,7 +947,7 @@
         <w:rPr>
           <w:noProof/>
         </w:rPr>
-        <w:instrText xml:space="preserve"> PAGEREF _Toc243909184 \h </w:instrText>
+        <w:instrText xml:space="preserve"> PAGEREF _Toc243909570 \h </w:instrText>
       </w:r>
       <w:r>
         <w:rPr>
@@ -1005,7 +1005,7 @@
         <w:rPr>
           <w:noProof/>
         </w:rPr>
-        <w:instrText xml:space="preserve"> PAGEREF _Toc243909185 \h </w:instrText>
+        <w:instrText xml:space="preserve"> PAGEREF _Toc243909571 \h </w:instrText>
       </w:r>
       <w:r>
         <w:rPr>
@@ -1063,7 +1063,7 @@
         <w:rPr>
           <w:noProof/>
         </w:rPr>
-        <w:instrText xml:space="preserve"> PAGEREF _Toc243909186 \h </w:instrText>
+        <w:instrText xml:space="preserve"> PAGEREF _Toc243909572 \h </w:instrText>
       </w:r>
       <w:r>
         <w:rPr>
@@ -1121,7 +1121,7 @@
         <w:rPr>
           <w:noProof/>
         </w:rPr>
-        <w:instrText xml:space="preserve"> PAGEREF _Toc243909187 \h </w:instrText>
+        <w:instrText xml:space="preserve"> PAGEREF _Toc243909573 \h </w:instrText>
       </w:r>
       <w:r>
         <w:rPr>
@@ -1185,7 +1185,7 @@
         <w:rPr>
           <w:noProof/>
         </w:rPr>
-        <w:instrText xml:space="preserve"> PAGEREF _Toc243909188 \h </w:instrText>
+        <w:instrText xml:space="preserve"> PAGEREF _Toc243909574 \h </w:instrText>
       </w:r>
       <w:r>
         <w:rPr>
@@ -1249,7 +1249,7 @@
         <w:rPr>
           <w:noProof/>
         </w:rPr>
-        <w:instrText xml:space="preserve"> PAGEREF _Toc243909189 \h </w:instrText>
+        <w:instrText xml:space="preserve"> PAGEREF _Toc243909575 \h </w:instrText>
       </w:r>
       <w:r>
         <w:rPr>
@@ -1313,7 +1313,7 @@
         <w:rPr>
           <w:noProof/>
         </w:rPr>
-        <w:instrText xml:space="preserve"> PAGEREF _Toc243909190 \h </w:instrText>
+        <w:instrText xml:space="preserve"> PAGEREF _Toc243909576 \h </w:instrText>
       </w:r>
       <w:r>
         <w:rPr>
@@ -1371,7 +1371,7 @@
         <w:rPr>
           <w:noProof/>
         </w:rPr>
-        <w:instrText xml:space="preserve"> PAGEREF _Toc243909191 \h </w:instrText>
+        <w:instrText xml:space="preserve"> PAGEREF _Toc243909577 \h </w:instrText>
       </w:r>
       <w:r>
         <w:rPr>
@@ -1429,7 +1429,7 @@
         <w:rPr>
           <w:noProof/>
         </w:rPr>
-        <w:instrText xml:space="preserve"> PAGEREF _Toc243909192 \h </w:instrText>
+        <w:instrText xml:space="preserve"> PAGEREF _Toc243909578 \h </w:instrText>
       </w:r>
       <w:r>
         <w:rPr>
@@ -1487,7 +1487,7 @@
         <w:rPr>
           <w:noProof/>
         </w:rPr>
-        <w:instrText xml:space="preserve"> PAGEREF _Toc243909193 \h </w:instrText>
+        <w:instrText xml:space="preserve"> PAGEREF _Toc243909579 \h </w:instrText>
       </w:r>
       <w:r>
         <w:rPr>
@@ -1528,7 +1528,7 @@
       <w:pPr>
         <w:pStyle w:val="Ttulo1"/>
       </w:pPr>
-      <w:bookmarkStart w:id="1" w:name="_Toc243909176"/>
+      <w:bookmarkStart w:id="1" w:name="_Toc243909562"/>
       <w:r>
         <w:t>1. Introducción</w:t>
       </w:r>
@@ -1553,7 +1553,7 @@
       <w:pPr>
         <w:pStyle w:val="Ttulo1"/>
       </w:pPr>
-      <w:bookmarkStart w:id="2" w:name="_Toc243909177"/>
+      <w:bookmarkStart w:id="2" w:name="_Toc243909563"/>
       <w:r>
         <w:t>2. Descripción de la actividad</w:t>
       </w:r>
@@ -1618,8 +1618,9 @@
       <w:pPr>
         <w:pStyle w:val="Ttulo1"/>
       </w:pPr>
-      <w:bookmarkStart w:id="3" w:name="_Toc243909178"/>
-      <w:r>
+      <w:bookmarkStart w:id="3" w:name="_Toc243909564"/>
+      <w:r>
+        <w:lastRenderedPageBreak/>
         <w:t>3. Requisitos</w:t>
       </w:r>
       <w:bookmarkEnd w:id="3"/>
@@ -1628,7 +1629,7 @@
       <w:pPr>
         <w:pStyle w:val="Ttulo2"/>
       </w:pPr>
-      <w:bookmarkStart w:id="4" w:name="_Toc243909179"/>
+      <w:bookmarkStart w:id="4" w:name="_Toc243909565"/>
       <w:r>
         <w:t>3.1 Requisitos funcionales</w:t>
       </w:r>
@@ -2681,6 +2682,7 @@
               <w:rPr>
                 <w:sz w:val="18"/>
               </w:rPr>
+              <w:lastRenderedPageBreak/>
               <w:t>RF16</w:t>
             </w:r>
           </w:p>
@@ -2790,7 +2792,7 @@
       <w:pPr>
         <w:pStyle w:val="Ttulo2"/>
       </w:pPr>
-      <w:bookmarkStart w:id="5" w:name="_Toc243909180"/>
+      <w:bookmarkStart w:id="5" w:name="_Toc243909566"/>
       <w:r>
         <w:t>3.2 Requisitos no funcionales</w:t>
       </w:r>
@@ -3580,8 +3582,9 @@
       <w:pPr>
         <w:pStyle w:val="Ttulo1"/>
       </w:pPr>
-      <w:bookmarkStart w:id="6" w:name="_Toc243909181"/>
-      <w:r>
+      <w:bookmarkStart w:id="6" w:name="_Toc243909567"/>
+      <w:r>
+        <w:lastRenderedPageBreak/>
         <w:t>4. Configuración y puesta en marcha</w:t>
       </w:r>
       <w:bookmarkEnd w:id="6"/>
@@ -3595,7 +3598,7 @@
       <w:pPr>
         <w:pStyle w:val="Ttulo2"/>
       </w:pPr>
-      <w:bookmarkStart w:id="7" w:name="_Toc243909182"/>
+      <w:bookmarkStart w:id="7" w:name="_Toc243909568"/>
       <w:r>
         <w:t>4.1 Cómo abrir la app y comprobar que funciona</w:t>
       </w:r>
@@ -3608,12 +3611,27 @@
     </w:p>
     <w:p>
       <w:r>
-        <w:t>Paso 1. Instalar Node.js 18 o superior (https://nodejs.org).</w:t>
-      </w:r>
-    </w:p>
-    <w:p>
-      <w:r>
-        <w:t>Paso 2. Levantar la API. En una terminal, dentro de la carpeta backend:</w:t>
+        <w:t>Paso 1. Instalar Node.js 18 o superior (https://nodejs.org). Es el único programa que hay que instalar.</w:t>
+      </w:r>
+    </w:p>
+    <w:p>
+      <w:r>
+        <w:t>Paso 2. Encender la API. En la carpeta del paquete, hacer doble clic en INICIAR-API.bat. Ese archivo se encarga de todo: crea el archivo de configuración con la dirección de la base de datos, instala las dependencias, crea el administrador y enciende el servidor. La primera vez tarda un minuto.</w:t>
+      </w:r>
+    </w:p>
+    <w:p>
+      <w:r>
+        <w:t>Al terminar, en esa misma ventana aparece el mensaje "API lista en http://localhost:4000". Para detenerla se presiona Ctrl + C en esa ventana.</w:t>
+      </w:r>
+    </w:p>
+    <w:p>
+      <w:r>
+        <w:t>Paso 3. Comprobar que la API está viva. En el navegador debe abrir http://localhost:4000/api/salud y mostrar: {"estado":"ok"}.</w:t>
+      </w:r>
+    </w:p>
+    <w:p>
+      <w:r>
+        <w:t>Paso 4. Abrir la aplicación. Hay dos opciones:</w:t>
       </w:r>
     </w:p>
     <w:p>
@@ -3621,7 +3639,7 @@
         <w:pStyle w:val="Prrafodelista"/>
       </w:pPr>
       <w:r>
-        <w:t>cp .env.example .env        (en Windows: copy .env.example .env)</w:t>
+        <w:t>Instalar el APK (app-release.apk) en un celular Android: se le pasa el archivo, en el celular se va a Ajustes → Aplicaciones → acceso especial → Instalar aplicaciones desconocidas, se activa la app desde donde se abre el archivo, y luego se abre el APK y se le da a Instalar.</w:t>
       </w:r>
     </w:p>
     <w:p>
@@ -3629,7 +3647,37 @@
         <w:pStyle w:val="Prrafodelista"/>
       </w:pPr>
       <w:r>
-        <w:t>Editar el archivo .env y pegar el valor de MONGO_URI que viene en el archivo conexion-base-de-datos.txt del paquete.</w:t>
+        <w:t>O bien abrir el proyecto en Android Studio (carpeta bolivar_aprende_y_trabaja) y darle al botón Run, que abre el emulador.</w:t>
+      </w:r>
+    </w:p>
+    <w:p>
+      <w:r>
+        <w:t>Paso 5. Iniciar sesión con el administrador: admin@bolivar.com y contraseña admin123.</w:t>
+      </w:r>
+    </w:p>
+    <w:p>
+      <w:r>
+        <w:t>Paso 6. Comprobar que todo está conectado. En el menú lateral se entra a "Gestión de datos": debe aparecer el chip verde "API conectada" y el listado de oportunidades que están guardadas en MongoDB. Si se crea una nueva, esta queda en la base de datos y aparece en el listado del inicio: ese es el ciclo completo de la API.</w:t>
+      </w:r>
+    </w:p>
+    <w:p>
+      <w:r>
+        <w:t>Si la aplicación se abre en un celular físico y sale el aviso "Sin conexión con el servidor", es porque el celular tiene que buscar la API en la red local. En ese caso, en la pantalla de inicio de sesión se toca el botón "Servidor: ..." y se escribe la dirección del computador donde está la API, por ejemplo http://192.168.1.50:4000/api (el celular y el computador deben estar en la misma red). La aplicación la recuerda y las demás veces entra directo. En el emulador de Android Studio no hace falta nada de esto, porque ya apunta al localhost del computador.</w:t>
+      </w:r>
+    </w:p>
+    <w:p>
+      <w:pPr>
+        <w:pStyle w:val="Ttulo2"/>
+      </w:pPr>
+      <w:bookmarkStart w:id="8" w:name="_Toc243909569"/>
+      <w:r>
+        <w:t>4.2 Levantar la API</w:t>
+      </w:r>
+      <w:bookmarkEnd w:id="8"/>
+    </w:p>
+    <w:p>
+      <w:r>
+        <w:t>1. Entrar a la carpeta del backend y instalar las dependencias:</w:t>
       </w:r>
     </w:p>
     <w:p>
@@ -3637,7 +3685,7 @@
         <w:pStyle w:val="Prrafodelista"/>
       </w:pPr>
       <w:r>
-        <w:t>npm install</w:t>
+        <w:t>cd backend</w:t>
       </w:r>
     </w:p>
     <w:p>
@@ -3645,86 +3693,7 @@
         <w:pStyle w:val="Prrafodelista"/>
       </w:pPr>
       <w:r>
-        <w:t>npm run seed                (crea el administrador: admin@bolivar.com / admin123)</w:t>
-      </w:r>
-    </w:p>
-    <w:p>
-      <w:pPr>
-        <w:pStyle w:val="Prrafodelista"/>
-      </w:pPr>
-      <w:r>
-        <w:t>npm start                   (la API queda escuchando en el puerto 4000)</w:t>
-      </w:r>
-    </w:p>
-    <w:p>
-      <w:r>
-        <w:t>Paso 3. Comprobar que la API está viva. En el navegador debe abrir http://localhost:4000/api/salud y mostrar: {"estado":"ok"}. (La primera vez tarda unos 40 segundos, porque la base de datos está en Atlas y la conexión es por internet.)</w:t>
-      </w:r>
-    </w:p>
-    <w:p>
-      <w:r>
-        <w:t>Paso 4. Abrir la aplicación. Hay dos opciones:</w:t>
-      </w:r>
-    </w:p>
-    <w:p>
-      <w:pPr>
-        <w:pStyle w:val="Prrafodelista"/>
-      </w:pPr>
-      <w:r>
-        <w:t>Instalar el APK (app-release.apk) en un celular Android: se le pasa el archivo, en el celular se va a Ajustes → Aplicaciones → acceso especial → Instalar aplicaciones desconocidas, se activa la app desde donde se abre el archivo, y luego se abre el APK y se le da a Instalar.</w:t>
-      </w:r>
-    </w:p>
-    <w:p>
-      <w:pPr>
-        <w:pStyle w:val="Prrafodelista"/>
-      </w:pPr>
-      <w:r>
-        <w:t>O bien abrir el proyecto en Android Studio (carpeta bolivar_aprende_y_trabaja) y darle al botón Run, que abre el emulador.</w:t>
-      </w:r>
-    </w:p>
-    <w:p>
-      <w:r>
-        <w:t>Paso 5. Iniciar sesión con el administrador: admin@bolivar.com y contraseña admin123.</w:t>
-      </w:r>
-    </w:p>
-    <w:p>
-      <w:r>
-        <w:t>Paso 6. Comprobar que todo está conectado. En el menú lateral se entra a "Gestión de datos": debe aparecer el chip verde "API conectada" y el listado de oportunidades que están guardadas en MongoDB. Si se crea una nueva, esta queda en la base de datos y aparece en el listado del inicio: ese es el ciclo completo de la API.</w:t>
-      </w:r>
-    </w:p>
-    <w:p>
-      <w:r>
-        <w:t>Si la aplicación se abre en un celular físico y sale el aviso "Sin conexión con el servidor", es porque el celular tiene que buscar la API en la red local. En ese caso, en la pantalla de inicio de sesión se toca el botón "Servidor: ..." y se escribe la dirección del computador donde está la API, por ejemplo http://192.168.1.50:4000/api (el celular y el computador deben estar en la misma red). La aplicación la recuerda y las demás veces entra directo. En el emulador de Android Studio no hace falta nada de esto, porque ya apunta al localhost del computador.</w:t>
-      </w:r>
-    </w:p>
-    <w:p>
-      <w:pPr>
-        <w:pStyle w:val="Ttulo2"/>
-      </w:pPr>
-      <w:bookmarkStart w:id="8" w:name="_Toc243909183"/>
-      <w:r>
-        <w:t>4.2 Levantar la API</w:t>
-      </w:r>
-      <w:bookmarkEnd w:id="8"/>
-    </w:p>
-    <w:p>
-      <w:r>
-        <w:t>1. Entrar a la carpeta del backend y instalar las dependencias:</w:t>
-      </w:r>
-    </w:p>
-    <w:p>
-      <w:pPr>
-        <w:pStyle w:val="Prrafodelista"/>
-      </w:pPr>
-      <w:r>
-        <w:t>cd backend</w:t>
-      </w:r>
-    </w:p>
-    <w:p>
-      <w:pPr>
-        <w:pStyle w:val="Prrafodelista"/>
-      </w:pPr>
-      <w:r>
+        <w:lastRenderedPageBreak/>
         <w:t>npm install</w:t>
       </w:r>
     </w:p>
@@ -4160,7 +4129,7 @@
       <w:pPr>
         <w:pStyle w:val="Ttulo2"/>
       </w:pPr>
-      <w:bookmarkStart w:id="9" w:name="_Toc243909184"/>
+      <w:bookmarkStart w:id="9" w:name="_Toc243909570"/>
       <w:r>
         <w:t>4.3 Correr la aplicación</w:t>
       </w:r>
@@ -4196,7 +4165,7 @@
       <w:pPr>
         <w:pStyle w:val="Ttulo2"/>
       </w:pPr>
-      <w:bookmarkStart w:id="10" w:name="_Toc243909185"/>
+      <w:bookmarkStart w:id="10" w:name="_Toc243909571"/>
       <w:r>
         <w:t>4.4 Compilar el APK de entrega</w:t>
       </w:r>
@@ -4219,8 +4188,9 @@
       <w:pPr>
         <w:pStyle w:val="Ttulo2"/>
       </w:pPr>
-      <w:bookmarkStart w:id="11" w:name="_Toc243909186"/>
-      <w:r>
+      <w:bookmarkStart w:id="11" w:name="_Toc243909572"/>
+      <w:r>
+        <w:lastRenderedPageBreak/>
         <w:t>4.5 Instalar el APK en un celular</w:t>
       </w:r>
       <w:bookmarkEnd w:id="11"/>
@@ -4258,7 +4228,7 @@
       <w:pPr>
         <w:pStyle w:val="Ttulo2"/>
       </w:pPr>
-      <w:bookmarkStart w:id="12" w:name="_Toc243909187"/>
+      <w:bookmarkStart w:id="12" w:name="_Toc243909573"/>
       <w:r>
         <w:t>4.6 Pruebas</w:t>
       </w:r>
@@ -4795,7 +4765,7 @@
       <w:pPr>
         <w:pStyle w:val="Ttulo1"/>
       </w:pPr>
-      <w:bookmarkStart w:id="13" w:name="_Toc243909188"/>
+      <w:bookmarkStart w:id="13" w:name="_Toc243909574"/>
       <w:r>
         <w:t>5. Resultados</w:t>
       </w:r>
@@ -4838,6 +4808,7 @@
     </w:p>
     <w:p>
       <w:r>
+        <w:lastRenderedPageBreak/>
         <w:t>5.4 Gestión de datos: el CRUD contra la API</w:t>
       </w:r>
     </w:p>
@@ -5164,7 +5135,7 @@
       <w:pPr>
         <w:pStyle w:val="Ttulo1"/>
       </w:pPr>
-      <w:bookmarkStart w:id="14" w:name="_Toc243909189"/>
+      <w:bookmarkStart w:id="14" w:name="_Toc243909575"/>
       <w:r>
         <w:t>6. Conclusiones</w:t>
       </w:r>
@@ -5187,6 +5158,7 @@
     </w:p>
     <w:p>
       <w:r>
+        <w:lastRenderedPageBreak/>
         <w:t>Como trabajo futuro queda publicar la API en internet para que la aplicación se pueda usar desde cualquier red, y agregar la pantalla de favoritos en la aplicación, que la API ya soporta pero la app todavía no muestra.</w:t>
       </w:r>
     </w:p>
@@ -5194,7 +5166,7 @@
       <w:pPr>
         <w:pStyle w:val="Ttulo1"/>
       </w:pPr>
-      <w:bookmarkStart w:id="15" w:name="_Toc243909190"/>
+      <w:bookmarkStart w:id="15" w:name="_Toc243909576"/>
       <w:r>
         <w:t>7. Anexo</w:t>
       </w:r>
@@ -5204,7 +5176,7 @@
       <w:pPr>
         <w:pStyle w:val="Ttulo2"/>
       </w:pPr>
-      <w:bookmarkStart w:id="16" w:name="_Toc243909191"/>
+      <w:bookmarkStart w:id="16" w:name="_Toc243909577"/>
       <w:r>
         <w:t>7.1 Enlaces</w:t>
       </w:r>
@@ -5539,7 +5511,7 @@
               <w:rPr>
                 <w:sz w:val="18"/>
               </w:rPr>
-              <w:t>archivo conexion-base-de-datos.txt del paquete</w:t>
+              <w:t>archivo configurar.env del paquete</w:t>
             </w:r>
           </w:p>
         </w:tc>
@@ -5550,7 +5522,7 @@
       <w:pPr>
         <w:pStyle w:val="Ttulo2"/>
       </w:pPr>
-      <w:bookmarkStart w:id="17" w:name="_Toc243909192"/>
+      <w:bookmarkStart w:id="17" w:name="_Toc243909578"/>
       <w:r>
         <w:t>7.2 Contenido del paquete de entrega</w:t>
       </w:r>
@@ -5647,6 +5619,50 @@
               <w:rPr>
                 <w:sz w:val="18"/>
               </w:rPr>
+              <w:t>INICIAR-API.bat</w:t>
+            </w:r>
+          </w:p>
+        </w:tc>
+        <w:tc>
+          <w:tcPr>
+            <w:tcW w:w="4419" w:type="dxa"/>
+          </w:tcPr>
+          <w:p>
+            <w:pPr>
+              <w:rPr>
+                <w:sz w:val="18"/>
+              </w:rPr>
+            </w:pPr>
+            <w:r>
+              <w:rPr>
+                <w:sz w:val="18"/>
+              </w:rPr>
+              <w:t>Doble clic y la API queda encendida (crea la configuración, instala y arranca).</w:t>
+            </w:r>
+          </w:p>
+        </w:tc>
+      </w:tr>
+      <w:tr>
+        <w:tblPrEx>
+          <w:tblCellMar>
+            <w:top w:w="0" w:type="dxa"/>
+            <w:bottom w:w="0" w:type="dxa"/>
+          </w:tblCellMar>
+        </w:tblPrEx>
+        <w:tc>
+          <w:tcPr>
+            <w:tcW w:w="4419" w:type="dxa"/>
+          </w:tcPr>
+          <w:p>
+            <w:pPr>
+              <w:rPr>
+                <w:sz w:val="18"/>
+              </w:rPr>
+            </w:pPr>
+            <w:r>
+              <w:rPr>
+                <w:sz w:val="18"/>
+              </w:rPr>
               <w:t>app-release.apk</w:t>
             </w:r>
           </w:p>
@@ -5779,25 +5795,25 @@
               <w:rPr>
                 <w:sz w:val="18"/>
               </w:rPr>
-              <w:t>conexion-base-de-datos.txt</w:t>
-            </w:r>
-          </w:p>
-        </w:tc>
-        <w:tc>
-          <w:tcPr>
-            <w:tcW w:w="4419" w:type="dxa"/>
-          </w:tcPr>
-          <w:p>
-            <w:pPr>
-              <w:rPr>
-                <w:sz w:val="18"/>
-              </w:rPr>
-            </w:pPr>
-            <w:r>
-              <w:rPr>
-                <w:sz w:val="18"/>
-              </w:rPr>
-              <w:t>El valor de MONGO_URI para levantar la API.</w:t>
+              <w:t>configurar.env</w:t>
+            </w:r>
+          </w:p>
+        </w:tc>
+        <w:tc>
+          <w:tcPr>
+            <w:tcW w:w="4419" w:type="dxa"/>
+          </w:tcPr>
+          <w:p>
+            <w:pPr>
+              <w:rPr>
+                <w:sz w:val="18"/>
+              </w:rPr>
+            </w:pPr>
+            <w:r>
+              <w:rPr>
+                <w:sz w:val="18"/>
+              </w:rPr>
+              <w:t>El archivo de configuración de la base de datos.</w:t>
             </w:r>
           </w:p>
         </w:tc>
@@ -5940,7 +5956,7 @@
       <w:pPr>
         <w:pStyle w:val="Ttulo2"/>
       </w:pPr>
-      <w:bookmarkStart w:id="18" w:name="_Toc243909193"/>
+      <w:bookmarkStart w:id="18" w:name="_Toc243909579"/>
       <w:r>
         <w:t>7.3 Estructura del proyecto</w:t>
       </w:r>
@@ -6125,6 +6141,7 @@
               <w:rPr>
                 <w:sz w:val="18"/>
               </w:rPr>
+              <w:lastRenderedPageBreak/>
               <w:t>backend/controllers/</w:t>
             </w:r>
           </w:p>
@@ -6683,11 +6700,12 @@
         <w:rPr>
           <w:noProof/>
         </w:rPr>
+        <w:lastRenderedPageBreak/>
         <w:drawing>
-          <wp:inline distT="0" distB="0" distL="0" distR="0" wp14:anchorId="05C410E4" wp14:editId="46C5D060">
+          <wp:inline distT="0" distB="0" distL="0" distR="0" wp14:anchorId="320AF6CC" wp14:editId="5746DE72">
             <wp:extent cx="4318000" cy="9355307"/>
             <wp:effectExtent l="0" t="0" r="6350" b="0"/>
-            <wp:docPr id="1968033975" name="Imagen 1"/>
+            <wp:docPr id="804929972" name="Imagen 1"/>
             <wp:cNvGraphicFramePr>
               <a:graphicFrameLocks xmlns:a="http://schemas.openxmlformats.org/drawingml/2006/main" noChangeAspect="1"/>
             </wp:cNvGraphicFramePr>
@@ -6695,7 +6713,7 @@
               <a:graphicData uri="http://schemas.openxmlformats.org/drawingml/2006/picture">
                 <pic:pic xmlns:pic="http://schemas.openxmlformats.org/drawingml/2006/picture">
                   <pic:nvPicPr>
-                    <pic:cNvPr id="1968033975" name=""/>
+                    <pic:cNvPr id="804929972" name=""/>
                     <pic:cNvPicPr/>
                   </pic:nvPicPr>
                   <pic:blipFill>
@@ -6742,10 +6760,10 @@
           <w:noProof/>
         </w:rPr>
         <w:drawing>
-          <wp:inline distT="0" distB="0" distL="0" distR="0" wp14:anchorId="6B8F279C" wp14:editId="3FE17156">
+          <wp:inline distT="0" distB="0" distL="0" distR="0" wp14:anchorId="656D45DB" wp14:editId="23D5AC7C">
             <wp:extent cx="4318000" cy="9355307"/>
             <wp:effectExtent l="0" t="0" r="6350" b="0"/>
-            <wp:docPr id="707043681" name="Imagen 2"/>
+            <wp:docPr id="776626724" name="Imagen 2"/>
             <wp:cNvGraphicFramePr>
               <a:graphicFrameLocks xmlns:a="http://schemas.openxmlformats.org/drawingml/2006/main" noChangeAspect="1"/>
             </wp:cNvGraphicFramePr>
@@ -6753,7 +6771,7 @@
               <a:graphicData uri="http://schemas.openxmlformats.org/drawingml/2006/picture">
                 <pic:pic xmlns:pic="http://schemas.openxmlformats.org/drawingml/2006/picture">
                   <pic:nvPicPr>
-                    <pic:cNvPr id="707043681" name=""/>
+                    <pic:cNvPr id="776626724" name=""/>
                     <pic:cNvPicPr/>
                   </pic:nvPicPr>
                   <pic:blipFill>
@@ -6800,10 +6818,10 @@
           <w:noProof/>
         </w:rPr>
         <w:drawing>
-          <wp:inline distT="0" distB="0" distL="0" distR="0" wp14:anchorId="1027CE28" wp14:editId="1C7B43B6">
+          <wp:inline distT="0" distB="0" distL="0" distR="0" wp14:anchorId="64C26D80" wp14:editId="708E72C4">
             <wp:extent cx="4318000" cy="9355307"/>
             <wp:effectExtent l="0" t="0" r="6350" b="0"/>
-            <wp:docPr id="2128959709" name="Imagen 3"/>
+            <wp:docPr id="1181089150" name="Imagen 3"/>
             <wp:cNvGraphicFramePr>
               <a:graphicFrameLocks xmlns:a="http://schemas.openxmlformats.org/drawingml/2006/main" noChangeAspect="1"/>
             </wp:cNvGraphicFramePr>
@@ -6811,7 +6829,7 @@
               <a:graphicData uri="http://schemas.openxmlformats.org/drawingml/2006/picture">
                 <pic:pic xmlns:pic="http://schemas.openxmlformats.org/drawingml/2006/picture">
                   <pic:nvPicPr>
-                    <pic:cNvPr id="2128959709" name=""/>
+                    <pic:cNvPr id="1181089150" name=""/>
                     <pic:cNvPicPr/>
                   </pic:nvPicPr>
                   <pic:blipFill>
@@ -6858,10 +6876,10 @@
           <w:noProof/>
         </w:rPr>
         <w:drawing>
-          <wp:inline distT="0" distB="0" distL="0" distR="0" wp14:anchorId="4FBF20A3" wp14:editId="35A1D529">
+          <wp:inline distT="0" distB="0" distL="0" distR="0" wp14:anchorId="1EBCF71B" wp14:editId="3CD91F31">
             <wp:extent cx="4318000" cy="9355307"/>
             <wp:effectExtent l="0" t="0" r="6350" b="0"/>
-            <wp:docPr id="1469937177" name="Imagen 4"/>
+            <wp:docPr id="1195166337" name="Imagen 4"/>
             <wp:cNvGraphicFramePr>
               <a:graphicFrameLocks xmlns:a="http://schemas.openxmlformats.org/drawingml/2006/main" noChangeAspect="1"/>
             </wp:cNvGraphicFramePr>
@@ -6869,7 +6887,7 @@
               <a:graphicData uri="http://schemas.openxmlformats.org/drawingml/2006/picture">
                 <pic:pic xmlns:pic="http://schemas.openxmlformats.org/drawingml/2006/picture">
                   <pic:nvPicPr>
-                    <pic:cNvPr id="1469937177" name=""/>
+                    <pic:cNvPr id="1195166337" name=""/>
                     <pic:cNvPicPr/>
                   </pic:nvPicPr>
                   <pic:blipFill>
@@ -6916,10 +6934,10 @@
           <w:noProof/>
         </w:rPr>
         <w:drawing>
-          <wp:inline distT="0" distB="0" distL="0" distR="0" wp14:anchorId="76371A2D" wp14:editId="7D07F729">
+          <wp:inline distT="0" distB="0" distL="0" distR="0" wp14:anchorId="2F5B2045" wp14:editId="5C3A1F8C">
             <wp:extent cx="4318000" cy="9355307"/>
             <wp:effectExtent l="0" t="0" r="6350" b="0"/>
-            <wp:docPr id="222899343" name="Imagen 5"/>
+            <wp:docPr id="2084870760" name="Imagen 5"/>
             <wp:cNvGraphicFramePr>
               <a:graphicFrameLocks xmlns:a="http://schemas.openxmlformats.org/drawingml/2006/main" noChangeAspect="1"/>
             </wp:cNvGraphicFramePr>
@@ -6927,7 +6945,7 @@
               <a:graphicData uri="http://schemas.openxmlformats.org/drawingml/2006/picture">
                 <pic:pic xmlns:pic="http://schemas.openxmlformats.org/drawingml/2006/picture">
                   <pic:nvPicPr>
-                    <pic:cNvPr id="222899343" name=""/>
+                    <pic:cNvPr id="2084870760" name=""/>
                     <pic:cNvPicPr/>
                   </pic:nvPicPr>
                   <pic:blipFill>
@@ -6974,10 +6992,10 @@
           <w:noProof/>
         </w:rPr>
         <w:drawing>
-          <wp:inline distT="0" distB="0" distL="0" distR="0" wp14:anchorId="5255AFE8" wp14:editId="2786E4E5">
+          <wp:inline distT="0" distB="0" distL="0" distR="0" wp14:anchorId="106EE79A" wp14:editId="1DD3AA54">
             <wp:extent cx="4318000" cy="9355307"/>
             <wp:effectExtent l="0" t="0" r="6350" b="0"/>
-            <wp:docPr id="1405416716" name="Imagen 6"/>
+            <wp:docPr id="325645658" name="Imagen 6"/>
             <wp:cNvGraphicFramePr>
               <a:graphicFrameLocks xmlns:a="http://schemas.openxmlformats.org/drawingml/2006/main" noChangeAspect="1"/>
             </wp:cNvGraphicFramePr>
@@ -6985,7 +7003,7 @@
               <a:graphicData uri="http://schemas.openxmlformats.org/drawingml/2006/picture">
                 <pic:pic xmlns:pic="http://schemas.openxmlformats.org/drawingml/2006/picture">
                   <pic:nvPicPr>
-                    <pic:cNvPr id="1405416716" name=""/>
+                    <pic:cNvPr id="325645658" name=""/>
                     <pic:cNvPicPr/>
                   </pic:nvPicPr>
                   <pic:blipFill>
@@ -7032,10 +7050,10 @@
           <w:noProof/>
         </w:rPr>
         <w:drawing>
-          <wp:inline distT="0" distB="0" distL="0" distR="0" wp14:anchorId="711074BE" wp14:editId="42DF18DA">
+          <wp:inline distT="0" distB="0" distL="0" distR="0" wp14:anchorId="0D5DFE05" wp14:editId="2ED97F6B">
             <wp:extent cx="4318000" cy="3626182"/>
             <wp:effectExtent l="0" t="0" r="6350" b="0"/>
-            <wp:docPr id="757816359" name="Imagen 7"/>
+            <wp:docPr id="1092408218" name="Imagen 7"/>
             <wp:cNvGraphicFramePr>
               <a:graphicFrameLocks xmlns:a="http://schemas.openxmlformats.org/drawingml/2006/main" noChangeAspect="1"/>
             </wp:cNvGraphicFramePr>
@@ -7043,7 +7061,7 @@
               <a:graphicData uri="http://schemas.openxmlformats.org/drawingml/2006/picture">
                 <pic:pic xmlns:pic="http://schemas.openxmlformats.org/drawingml/2006/picture">
                   <pic:nvPicPr>
-                    <pic:cNvPr id="757816359" name=""/>
+                    <pic:cNvPr id="1092408218" name=""/>
                     <pic:cNvPicPr/>
                   </pic:nvPicPr>
                   <pic:blipFill>
@@ -7501,7 +7519,7 @@
     <w:link w:val="Ttulo1Car"/>
     <w:uiPriority w:val="9"/>
     <w:qFormat/>
-    <w:rsid w:val="001E55CE"/>
+    <w:rsid w:val="00BF30FF"/>
     <w:pPr>
       <w:keepNext/>
       <w:keepLines/>
@@ -7523,7 +7541,7 @@
     <w:uiPriority w:val="9"/>
     <w:unhideWhenUsed/>
     <w:qFormat/>
-    <w:rsid w:val="001E55CE"/>
+    <w:rsid w:val="00BF30FF"/>
     <w:pPr>
       <w:keepNext/>
       <w:keepLines/>
@@ -7546,7 +7564,7 @@
     <w:semiHidden/>
     <w:unhideWhenUsed/>
     <w:qFormat/>
-    <w:rsid w:val="001E55CE"/>
+    <w:rsid w:val="00BF30FF"/>
     <w:pPr>
       <w:keepNext/>
       <w:keepLines/>
@@ -7569,7 +7587,7 @@
     <w:semiHidden/>
     <w:unhideWhenUsed/>
     <w:qFormat/>
-    <w:rsid w:val="001E55CE"/>
+    <w:rsid w:val="00BF30FF"/>
     <w:pPr>
       <w:keepNext/>
       <w:keepLines/>
@@ -7592,7 +7610,7 @@
     <w:semiHidden/>
     <w:unhideWhenUsed/>
     <w:qFormat/>
-    <w:rsid w:val="001E55CE"/>
+    <w:rsid w:val="00BF30FF"/>
     <w:pPr>
       <w:keepNext/>
       <w:keepLines/>
@@ -7613,7 +7631,7 @@
     <w:semiHidden/>
     <w:unhideWhenUsed/>
     <w:qFormat/>
-    <w:rsid w:val="001E55CE"/>
+    <w:rsid w:val="00BF30FF"/>
     <w:pPr>
       <w:keepNext/>
       <w:keepLines/>
@@ -7636,7 +7654,7 @@
     <w:semiHidden/>
     <w:unhideWhenUsed/>
     <w:qFormat/>
-    <w:rsid w:val="001E55CE"/>
+    <w:rsid w:val="00BF30FF"/>
     <w:pPr>
       <w:keepNext/>
       <w:keepLines/>
@@ -7657,7 +7675,7 @@
     <w:semiHidden/>
     <w:unhideWhenUsed/>
     <w:qFormat/>
-    <w:rsid w:val="001E55CE"/>
+    <w:rsid w:val="00BF30FF"/>
     <w:pPr>
       <w:keepNext/>
       <w:keepLines/>
@@ -7680,7 +7698,7 @@
     <w:semiHidden/>
     <w:unhideWhenUsed/>
     <w:qFormat/>
-    <w:rsid w:val="001E55CE"/>
+    <w:rsid w:val="00BF30FF"/>
     <w:pPr>
       <w:keepNext/>
       <w:keepLines/>
@@ -7724,7 +7742,7 @@
     <w:basedOn w:val="Fuentedeprrafopredeter"/>
     <w:link w:val="Ttulo1"/>
     <w:uiPriority w:val="9"/>
-    <w:rsid w:val="001E55CE"/>
+    <w:rsid w:val="00BF30FF"/>
     <w:rPr>
       <w:rFonts w:asciiTheme="majorHAnsi" w:eastAsiaTheme="majorEastAsia" w:hAnsiTheme="majorHAnsi" w:cstheme="majorBidi"/>
       <w:color w:val="2F5496" w:themeColor="accent1" w:themeShade="BF"/>
@@ -7737,7 +7755,7 @@
     <w:basedOn w:val="Fuentedeprrafopredeter"/>
     <w:link w:val="Ttulo2"/>
     <w:uiPriority w:val="9"/>
-    <w:rsid w:val="001E55CE"/>
+    <w:rsid w:val="00BF30FF"/>
     <w:rPr>
       <w:rFonts w:asciiTheme="majorHAnsi" w:eastAsiaTheme="majorEastAsia" w:hAnsiTheme="majorHAnsi" w:cstheme="majorBidi"/>
       <w:color w:val="2F5496" w:themeColor="accent1" w:themeShade="BF"/>
@@ -7751,7 +7769,7 @@
     <w:link w:val="Ttulo3"/>
     <w:uiPriority w:val="9"/>
     <w:semiHidden/>
-    <w:rsid w:val="001E55CE"/>
+    <w:rsid w:val="00BF30FF"/>
     <w:rPr>
       <w:rFonts w:eastAsiaTheme="majorEastAsia" w:cstheme="majorBidi"/>
       <w:color w:val="2F5496" w:themeColor="accent1" w:themeShade="BF"/>
@@ -7765,7 +7783,7 @@
     <w:link w:val="Ttulo4"/>
     <w:uiPriority w:val="9"/>
     <w:semiHidden/>
-    <w:rsid w:val="001E55CE"/>
+    <w:rsid w:val="00BF30FF"/>
     <w:rPr>
       <w:rFonts w:eastAsiaTheme="majorEastAsia" w:cstheme="majorBidi"/>
       <w:i/>
@@ -7779,7 +7797,7 @@
     <w:link w:val="Ttulo5"/>
     <w:uiPriority w:val="9"/>
     <w:semiHidden/>
-    <w:rsid w:val="001E55CE"/>
+    <w:rsid w:val="00BF30FF"/>
     <w:rPr>
       <w:rFonts w:eastAsiaTheme="majorEastAsia" w:cstheme="majorBidi"/>
       <w:color w:val="2F5496" w:themeColor="accent1" w:themeShade="BF"/>
@@ -7791,7 +7809,7 @@
     <w:link w:val="Ttulo6"/>
     <w:uiPriority w:val="9"/>
     <w:semiHidden/>
-    <w:rsid w:val="001E55CE"/>
+    <w:rsid w:val="00BF30FF"/>
     <w:rPr>
       <w:rFonts w:eastAsiaTheme="majorEastAsia" w:cstheme="majorBidi"/>
       <w:i/>
@@ -7805,7 +7823,7 @@
     <w:link w:val="Ttulo7"/>
     <w:uiPriority w:val="9"/>
     <w:semiHidden/>
-    <w:rsid w:val="001E55CE"/>
+    <w:rsid w:val="00BF30FF"/>
     <w:rPr>
       <w:rFonts w:eastAsiaTheme="majorEastAsia" w:cstheme="majorBidi"/>
       <w:color w:val="595959" w:themeColor="text1" w:themeTint="A6"/>
@@ -7817,7 +7835,7 @@
     <w:link w:val="Ttulo8"/>
     <w:uiPriority w:val="9"/>
     <w:semiHidden/>
-    <w:rsid w:val="001E55CE"/>
+    <w:rsid w:val="00BF30FF"/>
     <w:rPr>
       <w:rFonts w:eastAsiaTheme="majorEastAsia" w:cstheme="majorBidi"/>
       <w:i/>
@@ -7831,7 +7849,7 @@
     <w:link w:val="Ttulo9"/>
     <w:uiPriority w:val="9"/>
     <w:semiHidden/>
-    <w:rsid w:val="001E55CE"/>
+    <w:rsid w:val="00BF30FF"/>
     <w:rPr>
       <w:rFonts w:eastAsiaTheme="majorEastAsia" w:cstheme="majorBidi"/>
       <w:color w:val="272727" w:themeColor="text1" w:themeTint="D8"/>
@@ -7844,7 +7862,7 @@
     <w:link w:val="TtuloCar"/>
     <w:uiPriority w:val="10"/>
     <w:qFormat/>
-    <w:rsid w:val="001E55CE"/>
+    <w:rsid w:val="00BF30FF"/>
     <w:pPr>
       <w:spacing w:after="80" w:line="240" w:lineRule="auto"/>
       <w:contextualSpacing/>
@@ -7862,7 +7880,7 @@
     <w:basedOn w:val="Fuentedeprrafopredeter"/>
     <w:link w:val="Ttulo"/>
     <w:uiPriority w:val="10"/>
-    <w:rsid w:val="001E55CE"/>
+    <w:rsid w:val="00BF30FF"/>
     <w:rPr>
       <w:rFonts w:asciiTheme="majorHAnsi" w:eastAsiaTheme="majorEastAsia" w:hAnsiTheme="majorHAnsi" w:cstheme="majorBidi"/>
       <w:spacing w:val="-10"/>
@@ -7878,7 +7896,7 @@
     <w:link w:val="SubttuloCar"/>
     <w:uiPriority w:val="11"/>
     <w:qFormat/>
-    <w:rsid w:val="001E55CE"/>
+    <w:rsid w:val="00BF30FF"/>
     <w:pPr>
       <w:numPr>
         <w:ilvl w:val="1"/>
@@ -7897,7 +7915,7 @@
     <w:basedOn w:val="Fuentedeprrafopredeter"/>
     <w:link w:val="Subttulo"/>
     <w:uiPriority w:val="11"/>
-    <w:rsid w:val="001E55CE"/>
+    <w:rsid w:val="00BF30FF"/>
     <w:rPr>
       <w:rFonts w:eastAsiaTheme="majorEastAsia" w:cstheme="majorBidi"/>
       <w:color w:val="595959" w:themeColor="text1" w:themeTint="A6"/>
@@ -7913,7 +7931,7 @@
     <w:link w:val="CitaCar"/>
     <w:uiPriority w:val="29"/>
     <w:qFormat/>
-    <w:rsid w:val="001E55CE"/>
+    <w:rsid w:val="00BF30FF"/>
     <w:pPr>
       <w:spacing w:before="160"/>
       <w:jc w:val="center"/>
@@ -7929,7 +7947,7 @@
     <w:basedOn w:val="Fuentedeprrafopredeter"/>
     <w:link w:val="Cita"/>
     <w:uiPriority w:val="29"/>
-    <w:rsid w:val="001E55CE"/>
+    <w:rsid w:val="00BF30FF"/>
     <w:rPr>
       <w:i/>
       <w:iCs/>
@@ -7941,7 +7959,7 @@
     <w:basedOn w:val="Normal"/>
     <w:uiPriority w:val="34"/>
     <w:qFormat/>
-    <w:rsid w:val="001E55CE"/>
+    <w:rsid w:val="00BF30FF"/>
     <w:pPr>
       <w:ind w:left="720"/>
       <w:contextualSpacing/>
@@ -7952,7 +7970,7 @@
     <w:basedOn w:val="Fuentedeprrafopredeter"/>
     <w:uiPriority w:val="21"/>
     <w:qFormat/>
-    <w:rsid w:val="001E55CE"/>
+    <w:rsid w:val="00BF30FF"/>
     <w:rPr>
       <w:i/>
       <w:iCs/>
@@ -7966,7 +7984,7 @@
     <w:link w:val="CitadestacadaCar"/>
     <w:uiPriority w:val="30"/>
     <w:qFormat/>
-    <w:rsid w:val="001E55CE"/>
+    <w:rsid w:val="00BF30FF"/>
     <w:pPr>
       <w:pBdr>
         <w:top w:val="single" w:sz="4" w:space="10" w:color="2F5496" w:themeColor="accent1" w:themeShade="BF"/>
@@ -7987,7 +8005,7 @@
     <w:basedOn w:val="Fuentedeprrafopredeter"/>
     <w:link w:val="Citadestacada"/>
     <w:uiPriority w:val="30"/>
-    <w:rsid w:val="001E55CE"/>
+    <w:rsid w:val="00BF30FF"/>
     <w:rPr>
       <w:i/>
       <w:iCs/>
@@ -7999,7 +8017,7 @@
     <w:basedOn w:val="Fuentedeprrafopredeter"/>
     <w:uiPriority w:val="32"/>
     <w:qFormat/>
-    <w:rsid w:val="001E55CE"/>
+    <w:rsid w:val="00BF30FF"/>
     <w:rPr>
       <w:b/>
       <w:bCs/>
@@ -8015,7 +8033,7 @@
     <w:autoRedefine/>
     <w:uiPriority w:val="39"/>
     <w:unhideWhenUsed/>
-    <w:rsid w:val="001E55CE"/>
+    <w:rsid w:val="00BF30FF"/>
     <w:pPr>
       <w:spacing w:after="100"/>
     </w:pPr>
@@ -8027,7 +8045,7 @@
     <w:uiPriority w:val="35"/>
     <w:unhideWhenUsed/>
     <w:qFormat/>
-    <w:rsid w:val="001E55CE"/>
+    <w:rsid w:val="00BF30FF"/>
     <w:pPr>
       <w:spacing w:after="200" w:line="240" w:lineRule="auto"/>
     </w:pPr>
@@ -8046,7 +8064,7 @@
     <w:autoRedefine/>
     <w:uiPriority w:val="39"/>
     <w:unhideWhenUsed/>
-    <w:rsid w:val="001E55CE"/>
+    <w:rsid w:val="00BF30FF"/>
     <w:pPr>
       <w:spacing w:after="100"/>
       <w:ind w:left="220"/>

</xml_diff>